<commit_message>
Add Products 36-39: Email Automation, Shopee Affiliate, Instagram Reels, Canva Design
- Product 36: Email Automation expanded to 18,276 words, 72 pages
- Product 37: Shopee Affiliate 17,068 words, 66 pages
- Product 38: Instagram Reels 17,145 words, 76 pages
- Product 39: Canva Design 17,065 words, 71 pages
- Product 40: ChatGPT manuscript ready (lint issue pending)
- All marketing packs and image assets included
</commit_message>
<xml_diff>
--- a/products/panduan-email-automation-ultimate.docx
+++ b/products/panduan-email-automation-ultimate.docx
@@ -4958,6 +4958,304 @@
       <w:r>
         <w:rPr>
           <w:rFonts w:ascii="Inter" w:cs="Inter" w:eastAsia="Inter" w:hAnsi="Inter"/>
+          <w:b/>
+          <w:bCs/>
+          <w:sz w:val="21"/>
+          <w:szCs w:val="21"/>
+        </w:rPr>
+        <w:t xml:space="preserve">Kesalahan Umum dalam Segmentasi:</w:t>
+      </w:r>
+    </w:p>
+    <w:p>
+      <w:pPr>
+        <w:spacing w:after="120"/>
+      </w:pPr>
+    </w:p>
+    <w:p>
+      <w:pPr>
+        <w:spacing w:after="120"/>
+      </w:pPr>
+      <w:r>
+        <w:rPr>
+          <w:rFonts w:ascii="Inter" w:cs="Inter" w:eastAsia="Inter" w:hAnsi="Inter"/>
+          <w:b/>
+          <w:bCs/>
+          <w:sz w:val="21"/>
+          <w:szCs w:val="21"/>
+        </w:rPr>
+        <w:t xml:space="preserve">Kesalahan 1: Terlalu Banyak Segmen di Awal</w:t>
+      </w:r>
+    </w:p>
+    <w:p>
+      <w:pPr>
+        <w:spacing w:after="120"/>
+      </w:pPr>
+      <w:r>
+        <w:rPr>
+          <w:rFonts w:ascii="Inter" w:cs="Inter" w:eastAsia="Inter" w:hAnsi="Inter"/>
+          <w:sz w:val="21"/>
+          <w:szCs w:val="21"/>
+        </w:rPr>
+        <w:t xml:space="preserve">Banyak UMKM yang bersemangat membuat 15-20 segmen sekaligus. Ini justru kontraproduktif karena Anda tidak akan mampu mengelola konten yang berbeda untuk setiap segmen. Mulailah dari 3-5 segmen utama, kuasai dulu, baru tambahkan segmen baru secara bertahap.</w:t>
+      </w:r>
+    </w:p>
+    <w:p>
+      <w:pPr>
+        <w:spacing w:after="120"/>
+      </w:pPr>
+    </w:p>
+    <w:p>
+      <w:pPr>
+        <w:spacing w:after="120"/>
+      </w:pPr>
+      <w:r>
+        <w:rPr>
+          <w:rFonts w:ascii="Inter" w:cs="Inter" w:eastAsia="Inter" w:hAnsi="Inter"/>
+          <w:b/>
+          <w:bCs/>
+          <w:sz w:val="21"/>
+          <w:szCs w:val="21"/>
+        </w:rPr>
+        <w:t xml:space="preserve">Kesalahan 2: Segmentasi Berdasarkan Asumsi, Bukan Data</w:t>
+      </w:r>
+    </w:p>
+    <w:p>
+      <w:pPr>
+        <w:spacing w:after="120"/>
+      </w:pPr>
+      <w:r>
+        <w:rPr>
+          <w:rFonts w:ascii="Inter" w:cs="Inter" w:eastAsia="Inter" w:hAnsi="Inter"/>
+          <w:sz w:val="21"/>
+          <w:szCs w:val="21"/>
+        </w:rPr>
+        <w:t xml:space="preserve">Jangan membuat segmen berdasarkan tebakan. "Sepertinya pelanggan wanita lebih suka diskon" bukan basis segmentasi yang valid. Gunakan data nyata: riwayat pembelian, perilaku buka email, dan interaksi dengan website. Jika data menunjukkan bahwa pelanggan di Surabaya memiliki conversion rate 2x lebih tinggi daripada kota lain, itu basis segmentasi yang valid.</w:t>
+      </w:r>
+    </w:p>
+    <w:p>
+      <w:pPr>
+        <w:spacing w:after="120"/>
+      </w:pPr>
+    </w:p>
+    <w:p>
+      <w:pPr>
+        <w:spacing w:after="120"/>
+      </w:pPr>
+      <w:r>
+        <w:rPr>
+          <w:rFonts w:ascii="Inter" w:cs="Inter" w:eastAsia="Inter" w:hAnsi="Inter"/>
+          <w:b/>
+          <w:bCs/>
+          <w:sz w:val="21"/>
+          <w:szCs w:val="21"/>
+        </w:rPr>
+        <w:t xml:space="preserve">Kesalahan 3: Tidak Pernah Me-refresh Segmen</w:t>
+      </w:r>
+    </w:p>
+    <w:p>
+      <w:pPr>
+        <w:spacing w:after="120"/>
+      </w:pPr>
+      <w:r>
+        <w:rPr>
+          <w:rFonts w:ascii="Inter" w:cs="Inter" w:eastAsia="Inter" w:hAnsi="Inter"/>
+          <w:sz w:val="21"/>
+          <w:szCs w:val="21"/>
+        </w:rPr>
+        <w:t xml:space="preserve">Segmen yang dibuat 6 bulan lalu mungkin sudah tidak akurat. Pelanggan yang dulu aktif bisa menjadi dormant. Subscriber yang dulu tertarik pada produk A sekarang mungkin lebih tertarik pada produk B. Review dan update segmen Anda setiap bulan berdasarkan data terbaru.</w:t>
+      </w:r>
+    </w:p>
+    <w:p>
+      <w:pPr>
+        <w:spacing w:after="120"/>
+      </w:pPr>
+    </w:p>
+    <w:p>
+      <w:pPr>
+        <w:spacing w:after="120"/>
+      </w:pPr>
+      <w:r>
+        <w:rPr>
+          <w:rFonts w:ascii="Inter" w:cs="Inter" w:eastAsia="Inter" w:hAnsi="Inter"/>
+          <w:b/>
+          <w:bCs/>
+          <w:sz w:val="21"/>
+          <w:szCs w:val="21"/>
+        </w:rPr>
+        <w:t xml:space="preserve">Kesalahan 4: Mengabaikan Subscriber yang Baru Bergabung</w:t>
+      </w:r>
+    </w:p>
+    <w:p>
+      <w:pPr>
+        <w:spacing w:after="120"/>
+      </w:pPr>
+      <w:r>
+        <w:rPr>
+          <w:rFonts w:ascii="Inter" w:cs="Inter" w:eastAsia="Inter" w:hAnsi="Inter"/>
+          <w:sz w:val="21"/>
+          <w:szCs w:val="21"/>
+        </w:rPr>
+        <w:t xml:space="preserve">Subscriber baru berada di titik engagement tertinggi. Perlakukan mereka sebagai segmen terpisah dengan konten onboarding yang khusus. Jangan langsung mengirim email promosi kepada subscriber yang baru bergabung hari ini. Berikan mereka waktu untuk mengenal brand Anda melalui welcome series terlebih dahulu.</w:t>
+      </w:r>
+    </w:p>
+    <w:p>
+      <w:pPr>
+        <w:spacing w:after="120"/>
+      </w:pPr>
+    </w:p>
+    <w:p>
+      <w:pPr>
+        <w:spacing w:after="120"/>
+      </w:pPr>
+      <w:r>
+        <w:rPr>
+          <w:rFonts w:ascii="Inter" w:cs="Inter" w:eastAsia="Inter" w:hAnsi="Inter"/>
+          <w:b/>
+          <w:bCs/>
+          <w:sz w:val="21"/>
+          <w:szCs w:val="21"/>
+        </w:rPr>
+        <w:t xml:space="preserve">Contoh Praktis Segmentasi untuk Toko Online Makanan:</w:t>
+      </w:r>
+    </w:p>
+    <w:p>
+      <w:pPr>
+        <w:spacing w:after="120"/>
+      </w:pPr>
+    </w:p>
+    <w:p>
+      <w:pPr>
+        <w:spacing w:after="120"/>
+      </w:pPr>
+      <w:r>
+        <w:rPr>
+          <w:rFonts w:ascii="Inter" w:cs="Inter" w:eastAsia="Inter" w:hAnsi="Inter"/>
+          <w:sz w:val="21"/>
+          <w:szCs w:val="21"/>
+        </w:rPr>
+        <w:t xml:space="preserve">Sebagai ilustrasi, bayangkan Anda menjalankan toko online yang menjual makanan sehat dan organik di Jakarta. Berikut adalah segmentasi yang bisa Anda terapkan:</w:t>
+      </w:r>
+    </w:p>
+    <w:p>
+      <w:pPr>
+        <w:spacing w:after="120"/>
+      </w:pPr>
+    </w:p>
+    <w:p>
+      <w:pPr>
+        <w:spacing w:after="120"/>
+      </w:pPr>
+      <w:r>
+        <w:rPr>
+          <w:rFonts w:ascii="Inter" w:cs="Inter" w:eastAsia="Inter" w:hAnsi="Inter"/>
+          <w:sz w:val="21"/>
+          <w:szCs w:val="21"/>
+        </w:rPr>
+        <w:t xml:space="preserve">Segmen 1: Pelanggan baru (0-30 hari sejak order pertama) - Kirim welcome series, edukasi tentang manfaat makanan organik, dan penawaran diskon untuk order kedua.</w:t>
+      </w:r>
+    </w:p>
+    <w:p>
+      <w:pPr>
+        <w:spacing w:after="120"/>
+      </w:pPr>
+    </w:p>
+    <w:p>
+      <w:pPr>
+        <w:spacing w:after="120"/>
+      </w:pPr>
+      <w:r>
+        <w:rPr>
+          <w:rFonts w:ascii="Inter" w:cs="Inter" w:eastAsia="Inter" w:hAnsi="Inter"/>
+          <w:sz w:val="21"/>
+          <w:szCs w:val="21"/>
+        </w:rPr>
+        <w:t xml:space="preserve">Segmen 2: Pelanggan rutin (order minimal 2x per bulan) - Kirim program loyalty, akses awal ke produk baru, dan rekomendasi berdasarkan preferensi rasa.</w:t>
+      </w:r>
+    </w:p>
+    <w:p>
+      <w:pPr>
+        <w:spacing w:after="120"/>
+      </w:pPr>
+    </w:p>
+    <w:p>
+      <w:pPr>
+        <w:spacing w:after="120"/>
+      </w:pPr>
+      <w:r>
+        <w:rPr>
+          <w:rFonts w:ascii="Inter" w:cs="Inter" w:eastAsia="Inter" w:hAnsi="Inter"/>
+          <w:sz w:val="21"/>
+          <w:szCs w:val="21"/>
+        </w:rPr>
+        <w:t xml:space="preserve">Segmen 3: Pelanggan dormant (tidak order 60+ hari) - Kirim re-engagement campaign dengan penawaran spesial dan reminder tentang manfaat makanan sehat.</w:t>
+      </w:r>
+    </w:p>
+    <w:p>
+      <w:pPr>
+        <w:spacing w:after="120"/>
+      </w:pPr>
+    </w:p>
+    <w:p>
+      <w:pPr>
+        <w:spacing w:after="120"/>
+      </w:pPr>
+      <w:r>
+        <w:rPr>
+          <w:rFonts w:ascii="Inter" w:cs="Inter" w:eastAsia="Inter" w:hAnsi="Inter"/>
+          <w:sz w:val="21"/>
+          <w:szCs w:val="21"/>
+        </w:rPr>
+        <w:t xml:space="preserve">Segmen 4: Pelanggan vegetarian - Kirim konten khusus tentang produk vegetarian baru, resep vegetarian, dan tips hidup sehat.</w:t>
+      </w:r>
+    </w:p>
+    <w:p>
+      <w:pPr>
+        <w:spacing w:after="120"/>
+      </w:pPr>
+    </w:p>
+    <w:p>
+      <w:pPr>
+        <w:spacing w:after="120"/>
+      </w:pPr>
+      <w:r>
+        <w:rPr>
+          <w:rFonts w:ascii="Inter" w:cs="Inter" w:eastAsia="Inter" w:hAnsi="Inter"/>
+          <w:sz w:val="21"/>
+          <w:szCs w:val="21"/>
+        </w:rPr>
+        <w:t xml:space="preserve">Segmen 5: Pelanggan corporate - Kirim penawaran paket catering kantor, diskon untuk order dalam jumlah besar, dan menu spesial untuk meeting.</w:t>
+      </w:r>
+    </w:p>
+    <w:p>
+      <w:pPr>
+        <w:spacing w:after="120"/>
+      </w:pPr>
+    </w:p>
+    <w:p>
+      <w:pPr>
+        <w:spacing w:after="120"/>
+      </w:pPr>
+      <w:r>
+        <w:rPr>
+          <w:rFonts w:ascii="Inter" w:cs="Inter" w:eastAsia="Inter" w:hAnsi="Inter"/>
+          <w:sz w:val="21"/>
+          <w:szCs w:val="21"/>
+        </w:rPr>
+        <w:t xml:space="preserve">Setiap segmen menerima email yang berbeda dengan konten yang relevan untuk kebutuhan dan minat mereka. Hasilnya, engagement rate meningkat, unsubscribe rate menurun, dan revenue per email naik signifikan.</w:t>
+      </w:r>
+    </w:p>
+    <w:p>
+      <w:pPr>
+        <w:spacing w:after="120"/>
+      </w:pPr>
+    </w:p>
+    <w:p>
+      <w:pPr>
+        <w:spacing w:after="120"/>
+      </w:pPr>
+      <w:r>
+        <w:rPr>
+          <w:rFonts w:ascii="Inter" w:cs="Inter" w:eastAsia="Inter" w:hAnsi="Inter"/>
           <w:sz w:val="21"/>
           <w:szCs w:val="21"/>
         </w:rPr>
@@ -6654,6 +6952,674 @@
       <w:r>
         <w:rPr>
           <w:rFonts w:ascii="Inter" w:cs="Inter" w:eastAsia="Inter" w:hAnsi="Inter"/>
+          <w:b/>
+          <w:bCs/>
+          <w:sz w:val="21"/>
+          <w:szCs w:val="21"/>
+        </w:rPr>
+        <w:t xml:space="preserve">Framework Copywriting Tambahan untuk Email:</w:t>
+      </w:r>
+    </w:p>
+    <w:p>
+      <w:pPr>
+        <w:spacing w:after="120"/>
+      </w:pPr>
+    </w:p>
+    <w:p>
+      <w:pPr>
+        <w:spacing w:after="120"/>
+      </w:pPr>
+      <w:r>
+        <w:rPr>
+          <w:rFonts w:ascii="Inter" w:cs="Inter" w:eastAsia="Inter" w:hAnsi="Inter"/>
+          <w:b/>
+          <w:bCs/>
+          <w:sz w:val="21"/>
+          <w:szCs w:val="21"/>
+        </w:rPr>
+        <w:t xml:space="preserve">Framework PAS (Problem, Agitate, Solution):</w:t>
+      </w:r>
+    </w:p>
+    <w:p>
+      <w:pPr>
+        <w:spacing w:after="120"/>
+      </w:pPr>
+      <w:r>
+        <w:rPr>
+          <w:rFonts w:ascii="Inter" w:cs="Inter" w:eastAsia="Inter" w:hAnsi="Inter"/>
+          <w:sz w:val="21"/>
+          <w:szCs w:val="21"/>
+        </w:rPr>
+        <w:t xml:space="preserve">Framework ini sangat efektif untuk email yang bertujuan mendorong tindakan. Pertama, identifikasi masalah yang dihadapi pembaca. Kedua, perbesar masalah tersebut dengan menjelaskan konsekuensi jika tidak ditangani. Ketiga, tawarkan solusi Anda sebagai jalan keluar.</w:t>
+      </w:r>
+    </w:p>
+    <w:p>
+      <w:pPr>
+        <w:spacing w:after="120"/>
+      </w:pPr>
+    </w:p>
+    <w:p>
+      <w:pPr>
+        <w:spacing w:after="120"/>
+      </w:pPr>
+      <w:r>
+        <w:rPr>
+          <w:rFonts w:ascii="Inter" w:cs="Inter" w:eastAsia="Inter" w:hAnsi="Inter"/>
+          <w:sz w:val="21"/>
+          <w:szCs w:val="21"/>
+        </w:rPr>
+        <w:t xml:space="preserve">Contoh penerapan untuk toko skincare:</w:t>
+      </w:r>
+    </w:p>
+    <w:p>
+      <w:pPr>
+        <w:spacing w:after="60"/>
+      </w:pPr>
+      <w:r>
+        <w:rPr>
+          <w:rFonts w:ascii="Inter" w:cs="Inter" w:eastAsia="Inter" w:hAnsi="Inter"/>
+          <w:sz w:val="21"/>
+          <w:szCs w:val="21"/>
+        </w:rPr>
+        <w:t xml:space="preserve">• </w:t>
+      </w:r>
+      <w:r>
+        <w:rPr>
+          <w:rFonts w:ascii="Inter" w:cs="Inter" w:eastAsia="Inter" w:hAnsi="Inter"/>
+          <w:sz w:val="21"/>
+          <w:szCs w:val="21"/>
+        </w:rPr>
+        <w:t xml:space="preserve">Problem: "Kulit wajah kusam dan berjerawat membuat Anda tidak percaya diri?"</w:t>
+      </w:r>
+    </w:p>
+    <w:p>
+      <w:pPr>
+        <w:spacing w:after="60"/>
+      </w:pPr>
+      <w:r>
+        <w:rPr>
+          <w:rFonts w:ascii="Inter" w:cs="Inter" w:eastAsia="Inter" w:hAnsi="Inter"/>
+          <w:sz w:val="21"/>
+          <w:szCs w:val="21"/>
+        </w:rPr>
+        <w:t xml:space="preserve">• </w:t>
+      </w:r>
+      <w:r>
+        <w:rPr>
+          <w:rFonts w:ascii="Inter" w:cs="Inter" w:eastAsia="Inter" w:hAnsi="Inter"/>
+          <w:sz w:val="21"/>
+          <w:szCs w:val="21"/>
+        </w:rPr>
+        <w:t xml:space="preserve">Agitate: "Setiap hari Anda menghindari cermin, menolak foto bareng teman, dan merasa minder di depan pasangan. Masalah ini tidak akan hilang sendiri jika Anda terus menggunakan produk yang salah."</w:t>
+      </w:r>
+    </w:p>
+    <w:p>
+      <w:pPr>
+        <w:spacing w:after="60"/>
+      </w:pPr>
+      <w:r>
+        <w:rPr>
+          <w:rFonts w:ascii="Inter" w:cs="Inter" w:eastAsia="Inter" w:hAnsi="Inter"/>
+          <w:sz w:val="21"/>
+          <w:szCs w:val="21"/>
+        </w:rPr>
+        <w:t xml:space="preserve">• </w:t>
+      </w:r>
+      <w:r>
+        <w:rPr>
+          <w:rFonts w:ascii="Inter" w:cs="Inter" w:eastAsia="Inter" w:hAnsi="Inter"/>
+          <w:sz w:val="21"/>
+          <w:szCs w:val="21"/>
+        </w:rPr>
+        <w:t xml:space="preserve">Solution: "Serum vitamin C kami sudah membantu 5.000 wanita Indonesia mendapatkan kulit cerah dan bebas jerawat dalam 30 hari. Lihat transformasi mereka di sini."</w:t>
+      </w:r>
+    </w:p>
+    <w:p>
+      <w:pPr>
+        <w:spacing w:after="120"/>
+      </w:pPr>
+    </w:p>
+    <w:p>
+      <w:pPr>
+        <w:spacing w:after="120"/>
+      </w:pPr>
+      <w:r>
+        <w:rPr>
+          <w:rFonts w:ascii="Inter" w:cs="Inter" w:eastAsia="Inter" w:hAnsi="Inter"/>
+          <w:b/>
+          <w:bCs/>
+          <w:sz w:val="21"/>
+          <w:szCs w:val="21"/>
+        </w:rPr>
+        <w:t xml:space="preserve">Framework AIDA (Attention, Interest, Desire, Action):</w:t>
+      </w:r>
+    </w:p>
+    <w:p>
+      <w:pPr>
+        <w:spacing w:after="120"/>
+      </w:pPr>
+      <w:r>
+        <w:rPr>
+          <w:rFonts w:ascii="Inter" w:cs="Inter" w:eastAsia="Inter" w:hAnsi="Inter"/>
+          <w:sz w:val="21"/>
+          <w:szCs w:val="21"/>
+        </w:rPr>
+        <w:t xml:space="preserve">Framework klasik yang selalu efektif. Pertama, tarik perhatian dengan headline yang kuat. Kedua, bangun minat dengan informasi yang relevan. Ketiga, ciptakan keinginan dengan benefit dan social proof. Keempat, dorong tindakan dengan CTA yang jelas.</w:t>
+      </w:r>
+    </w:p>
+    <w:p>
+      <w:pPr>
+        <w:spacing w:after="120"/>
+      </w:pPr>
+    </w:p>
+    <w:p>
+      <w:pPr>
+        <w:spacing w:after="120"/>
+      </w:pPr>
+      <w:r>
+        <w:rPr>
+          <w:rFonts w:ascii="Inter" w:cs="Inter" w:eastAsia="Inter" w:hAnsi="Inter"/>
+          <w:b/>
+          <w:bCs/>
+          <w:sz w:val="21"/>
+          <w:szCs w:val="21"/>
+        </w:rPr>
+        <w:t xml:space="preserve">Framework Storytelling:</w:t>
+      </w:r>
+    </w:p>
+    <w:p>
+      <w:pPr>
+        <w:spacing w:after="120"/>
+      </w:pPr>
+      <w:r>
+        <w:rPr>
+          <w:rFonts w:ascii="Inter" w:cs="Inter" w:eastAsia="Inter" w:hAnsi="Inter"/>
+          <w:sz w:val="21"/>
+          <w:szCs w:val="21"/>
+        </w:rPr>
+        <w:t xml:space="preserve">Cerita adalah cara paling powerful untuk menyampaikan pesan marketing. Mulailah dengan karakter (pelanggan atau founder), hadapi konflik (masalah yang dialami), dan akhiri dengan resolusi (solusi dari produk Anda).</w:t>
+      </w:r>
+    </w:p>
+    <w:p>
+      <w:pPr>
+        <w:spacing w:after="120"/>
+      </w:pPr>
+    </w:p>
+    <w:p>
+      <w:pPr>
+        <w:spacing w:after="120"/>
+      </w:pPr>
+      <w:r>
+        <w:rPr>
+          <w:rFonts w:ascii="Inter" w:cs="Inter" w:eastAsia="Inter" w:hAnsi="Inter"/>
+          <w:sz w:val="21"/>
+          <w:szCs w:val="21"/>
+        </w:rPr>
+        <w:t xml:space="preserve">Contoh storytelling untuk email:</w:t>
+      </w:r>
+    </w:p>
+    <w:p>
+      <w:pPr>
+        <w:spacing w:after="120"/>
+      </w:pPr>
+      <w:r>
+        <w:rPr>
+          <w:rFonts w:ascii="Inter" w:cs="Inter" w:eastAsia="Inter" w:hAnsi="Inter"/>
+          <w:sz w:val="21"/>
+          <w:szCs w:val="21"/>
+        </w:rPr>
+        <w:t xml:space="preserve">"Halo [Nama], tiga bulan lalu saya hampir menutup bisnis saya. Omzet turun 60 persen, karyawan mulai resah, dan saya tidak tahu harus berbuat apa. Kemudian saya menemukan satu strategi marketing yang mengubah segalanya. Dalam 60 hari, omzet saya naik 3x lipat. Hari ini saya ingin berbagi strategi tersebut dengan Anda..."</w:t>
+      </w:r>
+    </w:p>
+    <w:p>
+      <w:pPr>
+        <w:spacing w:after="120"/>
+      </w:pPr>
+    </w:p>
+    <w:p>
+      <w:pPr>
+        <w:spacing w:after="120"/>
+      </w:pPr>
+      <w:r>
+        <w:rPr>
+          <w:rFonts w:ascii="Inter" w:cs="Inter" w:eastAsia="Inter" w:hAnsi="Inter"/>
+          <w:b/>
+          <w:bCs/>
+          <w:sz w:val="21"/>
+          <w:szCs w:val="21"/>
+        </w:rPr>
+        <w:t xml:space="preserve">Template 5: Event Invitation Email</w:t>
+      </w:r>
+    </w:p>
+    <w:p>
+      <w:pPr>
+        <w:spacing w:after="120"/>
+      </w:pPr>
+    </w:p>
+    <w:p>
+      <w:pPr>
+        <w:spacing w:after="120"/>
+      </w:pPr>
+      <w:r>
+        <w:rPr>
+          <w:rFonts w:ascii="Inter" w:cs="Inter" w:eastAsia="Inter" w:hAnsi="Inter"/>
+          <w:sz w:val="21"/>
+          <w:szCs w:val="21"/>
+        </w:rPr>
+        <w:t xml:space="preserve">Subject: "Undangan Eksklusif: [Nama Event] Khusus untuk Subscriber"</w:t>
+      </w:r>
+    </w:p>
+    <w:p>
+      <w:pPr>
+        <w:spacing w:after="120"/>
+      </w:pPr>
+    </w:p>
+    <w:p>
+      <w:pPr>
+        <w:spacing w:after="120"/>
+      </w:pPr>
+      <w:r>
+        <w:rPr>
+          <w:rFonts w:ascii="Inter" w:cs="Inter" w:eastAsia="Inter" w:hAnsi="Inter"/>
+          <w:sz w:val="21"/>
+          <w:szCs w:val="21"/>
+        </w:rPr>
+        <w:t xml:space="preserve">Body:</w:t>
+      </w:r>
+    </w:p>
+    <w:p>
+      <w:pPr>
+        <w:shd w:fill="F1F5F9" w:val="clear"/>
+        <w:spacing w:after="120" w:before="120"/>
+      </w:pPr>
+      <w:r>
+        <w:rPr>
+          <w:rFonts w:ascii="Courier New" w:cs="Courier New" w:eastAsia="Courier New" w:hAnsi="Courier New"/>
+          <w:color w:val="1E293B"/>
+          <w:sz w:val="18"/>
+          <w:szCs w:val="18"/>
+        </w:rPr>
+        <w:t xml:space="preserve">Halo [Nama],
+Kami ingin mengundang Anda secara pribadi untuk:
+[NAMA EVENT]
+Tanggal: [Tanggal]
+Waktu: [Waktu]
+Lokasi: [Lokasi/Link]
+Sebagai subscriber setia [Brand], Anda mendapat:
+- Akses prioritas sebelum dibuka untuk umum
+- [Benefit eksklusif 1]
+- [Benefit eksklusif 2]
+- Harga spesial khusus peserta dari email
+[TOMBOL: Daftar Sekarang - Gratis]
+Kuota terbatas untuk 50 peserta pertama. Daftar sebelum [deadline].
+Sampai jumpa di event!
+Salam,
+[Nama]
+[Brand]</w:t>
+      </w:r>
+    </w:p>
+    <w:p>
+      <w:pPr>
+        <w:spacing w:after="120"/>
+      </w:pPr>
+    </w:p>
+    <w:p>
+      <w:pPr>
+        <w:spacing w:after="120"/>
+      </w:pPr>
+      <w:r>
+        <w:rPr>
+          <w:rFonts w:ascii="Inter" w:cs="Inter" w:eastAsia="Inter" w:hAnsi="Inter"/>
+          <w:b/>
+          <w:bCs/>
+          <w:sz w:val="21"/>
+          <w:szCs w:val="21"/>
+        </w:rPr>
+        <w:t xml:space="preserve">Template 6: Win-Back Email Series</w:t>
+      </w:r>
+    </w:p>
+    <w:p>
+      <w:pPr>
+        <w:spacing w:after="120"/>
+      </w:pPr>
+    </w:p>
+    <w:p>
+      <w:pPr>
+        <w:spacing w:after="120"/>
+      </w:pPr>
+      <w:r>
+        <w:rPr>
+          <w:rFonts w:ascii="Inter" w:cs="Inter" w:eastAsia="Inter" w:hAnsi="Inter"/>
+          <w:sz w:val="21"/>
+          <w:szCs w:val="21"/>
+        </w:rPr>
+        <w:t xml:space="preserve">Email 1 (Subject: "[Nama], kami punya sesuatu untuk Anda"):</w:t>
+      </w:r>
+    </w:p>
+    <w:p>
+      <w:pPr>
+        <w:shd w:fill="F1F5F9" w:val="clear"/>
+        <w:spacing w:after="120" w:before="120"/>
+      </w:pPr>
+      <w:r>
+        <w:rPr>
+          <w:rFonts w:ascii="Courier New" w:cs="Courier New" w:eastAsia="Courier New" w:hAnsi="Courier New"/>
+          <w:color w:val="1E293B"/>
+          <w:sz w:val="18"/>
+          <w:szCs w:val="18"/>
+        </w:rPr>
+        <w:t xml:space="preserve">Halo [Nama],
+Sudah [X bulan] sejak terakhir kali Anda berbelanja di [Brand].
+Kami ingin tahu: apakah ada yang bisa kami perbaiki?
+Sebagai apresiasi atas kesetiaan Anda, kami berikan:
+KODE: WELCOME_BACK_30
+Diskon 30% untuk pembelian berikutnya
+[TOMBOL: Belanja Sekarang]
+Kami terus berinovasi untuk memberikan yang terbaik.
+Kunjungi website kami untuk melihat koleksi terbaru.
+Salam hangat,
+Tim [Brand]</w:t>
+      </w:r>
+    </w:p>
+    <w:p>
+      <w:pPr>
+        <w:spacing w:after="120"/>
+      </w:pPr>
+    </w:p>
+    <w:p>
+      <w:pPr>
+        <w:spacing w:after="120"/>
+      </w:pPr>
+      <w:r>
+        <w:rPr>
+          <w:rFonts w:ascii="Inter" w:cs="Inter" w:eastAsia="Inter" w:hAnsi="Inter"/>
+          <w:sz w:val="21"/>
+          <w:szCs w:val="21"/>
+        </w:rPr>
+        <w:t xml:space="preserve">Email 2 (kirim 3 hari kemudian jika tidak ada respons):</w:t>
+      </w:r>
+    </w:p>
+    <w:p>
+      <w:pPr>
+        <w:shd w:fill="F1F5F9" w:val="clear"/>
+        <w:spacing w:after="120" w:before="120"/>
+      </w:pPr>
+      <w:r>
+        <w:rPr>
+          <w:rFonts w:ascii="Courier New" w:cs="Courier New" w:eastAsia="Courier New" w:hAnsi="Courier New"/>
+          <w:color w:val="1E293B"/>
+          <w:sz w:val="18"/>
+          <w:szCs w:val="18"/>
+        </w:rPr>
+        <w:t xml:space="preserve">Halo [Nama],
+Penawaran 30% Anda masih berlaku, tapi hanya sampai besok!
+Beberapa produk yang mungkin Anda sukai:
+- [Produk 1] - [Harga setelah diskon]
+- [Produk 2] - [Harga setelah diskon]
+- [Produk 3] - [Harga setelah diskon]
+[TOMBOL: Klaim Diskon Sebelum Kedaluwarsa]
+Jangan sampai ketinggalan, [Nama]!
+Salam,
+Tim [Brand]</w:t>
+      </w:r>
+    </w:p>
+    <w:p>
+      <w:pPr>
+        <w:spacing w:after="120"/>
+      </w:pPr>
+    </w:p>
+    <w:p>
+      <w:pPr>
+        <w:spacing w:after="120"/>
+      </w:pPr>
+      <w:r>
+        <w:rPr>
+          <w:rFonts w:ascii="Inter" w:cs="Inter" w:eastAsia="Inter" w:hAnsi="Inter"/>
+          <w:b/>
+          <w:bCs/>
+          <w:sz w:val="21"/>
+          <w:szCs w:val="21"/>
+        </w:rPr>
+        <w:t xml:space="preserve">Tips Menulis Subject Line yang Tidak Bisa Diabaikan:</w:t>
+      </w:r>
+    </w:p>
+    <w:p>
+      <w:pPr>
+        <w:spacing w:after="120"/>
+      </w:pPr>
+    </w:p>
+    <w:p>
+      <w:pPr>
+        <w:spacing w:after="120"/>
+      </w:pPr>
+      <w:r>
+        <w:rPr>
+          <w:rFonts w:ascii="Inter" w:cs="Inter" w:eastAsia="Inter" w:hAnsi="Inter"/>
+          <w:sz w:val="21"/>
+          <w:szCs w:val="21"/>
+        </w:rPr>
+        <w:t xml:space="preserve">Rahasia subject line yang efektif ada di formula SPICED:</w:t>
+      </w:r>
+    </w:p>
+    <w:p>
+      <w:pPr>
+        <w:spacing w:after="60"/>
+      </w:pPr>
+      <w:r>
+        <w:rPr>
+          <w:rFonts w:ascii="Inter" w:cs="Inter" w:eastAsia="Inter" w:hAnsi="Inter"/>
+          <w:sz w:val="21"/>
+          <w:szCs w:val="21"/>
+        </w:rPr>
+        <w:t xml:space="preserve">• </w:t>
+      </w:r>
+      <w:r>
+        <w:rPr>
+          <w:rFonts w:ascii="Inter" w:cs="Inter" w:eastAsia="Inter" w:hAnsi="Inter"/>
+          <w:sz w:val="21"/>
+          <w:szCs w:val="21"/>
+        </w:rPr>
+        <w:t xml:space="preserve">Specific: Gunakan angka dan detail spesifik, bukan generalisasi</w:t>
+      </w:r>
+    </w:p>
+    <w:p>
+      <w:pPr>
+        <w:spacing w:after="60"/>
+      </w:pPr>
+      <w:r>
+        <w:rPr>
+          <w:rFonts w:ascii="Inter" w:cs="Inter" w:eastAsia="Inter" w:hAnsi="Inter"/>
+          <w:sz w:val="21"/>
+          <w:szCs w:val="21"/>
+        </w:rPr>
+        <w:t xml:space="preserve">• </w:t>
+      </w:r>
+      <w:r>
+        <w:rPr>
+          <w:rFonts w:ascii="Inter" w:cs="Inter" w:eastAsia="Inter" w:hAnsi="Inter"/>
+          <w:sz w:val="21"/>
+          <w:szCs w:val="21"/>
+        </w:rPr>
+        <w:t xml:space="preserve">Provocative: Buat pembaca penasaran tanpa clickbait</w:t>
+      </w:r>
+    </w:p>
+    <w:p>
+      <w:pPr>
+        <w:spacing w:after="60"/>
+      </w:pPr>
+      <w:r>
+        <w:rPr>
+          <w:rFonts w:ascii="Inter" w:cs="Inter" w:eastAsia="Inter" w:hAnsi="Inter"/>
+          <w:sz w:val="21"/>
+          <w:szCs w:val="21"/>
+        </w:rPr>
+        <w:t xml:space="preserve">• </w:t>
+      </w:r>
+      <w:r>
+        <w:rPr>
+          <w:rFonts w:ascii="Inter" w:cs="Inter" w:eastAsia="Inter" w:hAnsi="Inter"/>
+          <w:sz w:val="21"/>
+          <w:szCs w:val="21"/>
+        </w:rPr>
+        <w:t xml:space="preserve">Intelligent: Tunjukkan bahwa email ini berisi informasi berharga</w:t>
+      </w:r>
+    </w:p>
+    <w:p>
+      <w:pPr>
+        <w:spacing w:after="60"/>
+      </w:pPr>
+      <w:r>
+        <w:rPr>
+          <w:rFonts w:ascii="Inter" w:cs="Inter" w:eastAsia="Inter" w:hAnsi="Inter"/>
+          <w:sz w:val="21"/>
+          <w:szCs w:val="21"/>
+        </w:rPr>
+        <w:t xml:space="preserve">• </w:t>
+      </w:r>
+      <w:r>
+        <w:rPr>
+          <w:rFonts w:ascii="Inter" w:cs="Inter" w:eastAsia="Inter" w:hAnsi="Inter"/>
+          <w:sz w:val="21"/>
+          <w:szCs w:val="21"/>
+        </w:rPr>
+        <w:t xml:space="preserve">Clear: Pesan harus langsung dipahami dalam 3 detik</w:t>
+      </w:r>
+    </w:p>
+    <w:p>
+      <w:pPr>
+        <w:spacing w:after="60"/>
+      </w:pPr>
+      <w:r>
+        <w:rPr>
+          <w:rFonts w:ascii="Inter" w:cs="Inter" w:eastAsia="Inter" w:hAnsi="Inter"/>
+          <w:sz w:val="21"/>
+          <w:szCs w:val="21"/>
+        </w:rPr>
+        <w:t xml:space="preserve">• </w:t>
+      </w:r>
+      <w:r>
+        <w:rPr>
+          <w:rFonts w:ascii="Inter" w:cs="Inter" w:eastAsia="Inter" w:hAnsi="Inter"/>
+          <w:sz w:val="21"/>
+          <w:szCs w:val="21"/>
+        </w:rPr>
+        <w:t xml:space="preserve">Empathetic: Pahami kebutuhan dan emosi pembaca</w:t>
+      </w:r>
+    </w:p>
+    <w:p>
+      <w:pPr>
+        <w:spacing w:after="60"/>
+      </w:pPr>
+      <w:r>
+        <w:rPr>
+          <w:rFonts w:ascii="Inter" w:cs="Inter" w:eastAsia="Inter" w:hAnsi="Inter"/>
+          <w:sz w:val="21"/>
+          <w:szCs w:val="21"/>
+        </w:rPr>
+        <w:t xml:space="preserve">• </w:t>
+      </w:r>
+      <w:r>
+        <w:rPr>
+          <w:rFonts w:ascii="Inter" w:cs="Inter" w:eastAsia="Inter" w:hAnsi="Inter"/>
+          <w:sz w:val="21"/>
+          <w:szCs w:val="21"/>
+        </w:rPr>
+        <w:t xml:space="preserve">Dynamic: Gunakan kata-kata yang menciptakan sense of urgency atau excitement</w:t>
+      </w:r>
+    </w:p>
+    <w:p>
+      <w:pPr>
+        <w:spacing w:after="120"/>
+      </w:pPr>
+    </w:p>
+    <w:p>
+      <w:pPr>
+        <w:spacing w:after="120"/>
+      </w:pPr>
+      <w:r>
+        <w:rPr>
+          <w:rFonts w:ascii="Inter" w:cs="Inter" w:eastAsia="Inter" w:hAnsi="Inter"/>
+          <w:sz w:val="21"/>
+          <w:szCs w:val="21"/>
+        </w:rPr>
+        <w:t xml:space="preserve">Contoh transformasi subject line:</w:t>
+      </w:r>
+    </w:p>
+    <w:p>
+      <w:pPr>
+        <w:spacing w:after="60"/>
+      </w:pPr>
+      <w:r>
+        <w:rPr>
+          <w:rFonts w:ascii="Inter" w:cs="Inter" w:eastAsia="Inter" w:hAnsi="Inter"/>
+          <w:sz w:val="21"/>
+          <w:szCs w:val="21"/>
+        </w:rPr>
+        <w:t xml:space="preserve">• </w:t>
+      </w:r>
+      <w:r>
+        <w:rPr>
+          <w:rFonts w:ascii="Inter" w:cs="Inter" w:eastAsia="Inter" w:hAnsi="Inter"/>
+          <w:sz w:val="21"/>
+          <w:szCs w:val="21"/>
+        </w:rPr>
+        <w:t xml:space="preserve">Biasa: "Newsletter Minggu Ini" menjadi "3 Strategi yang Meningkatkan Omzet 200% (Studi Kasus Nyata)"</w:t>
+      </w:r>
+    </w:p>
+    <w:p>
+      <w:pPr>
+        <w:spacing w:after="60"/>
+      </w:pPr>
+      <w:r>
+        <w:rPr>
+          <w:rFonts w:ascii="Inter" w:cs="Inter" w:eastAsia="Inter" w:hAnsi="Inter"/>
+          <w:sz w:val="21"/>
+          <w:szCs w:val="21"/>
+        </w:rPr>
+        <w:t xml:space="preserve">• </w:t>
+      </w:r>
+      <w:r>
+        <w:rPr>
+          <w:rFonts w:ascii="Inter" w:cs="Inter" w:eastAsia="Inter" w:hAnsi="Inter"/>
+          <w:sz w:val="21"/>
+          <w:szCs w:val="21"/>
+        </w:rPr>
+        <w:t xml:space="preserve">Biasa: "Promo Bulan Ini" menjadi "Flash Sale 24 Jam: 50% Off Khusus 100 Pembeli Pertama"</w:t>
+      </w:r>
+    </w:p>
+    <w:p>
+      <w:pPr>
+        <w:spacing w:after="60"/>
+      </w:pPr>
+      <w:r>
+        <w:rPr>
+          <w:rFonts w:ascii="Inter" w:cs="Inter" w:eastAsia="Inter" w:hAnsi="Inter"/>
+          <w:sz w:val="21"/>
+          <w:szCs w:val="21"/>
+        </w:rPr>
+        <w:t xml:space="preserve">• </w:t>
+      </w:r>
+      <w:r>
+        <w:rPr>
+          <w:rFonts w:ascii="Inter" w:cs="Inter" w:eastAsia="Inter" w:hAnsi="Inter"/>
+          <w:sz w:val="21"/>
+          <w:szCs w:val="21"/>
+        </w:rPr>
+        <w:t xml:space="preserve">Biasa: "Produk Baru Kami" menjadi "[Nama], Anda Pertama yang Bisa Coba Produk Baru Ini"</w:t>
+      </w:r>
+    </w:p>
+    <w:p>
+      <w:pPr>
+        <w:spacing w:after="120"/>
+      </w:pPr>
+    </w:p>
+    <w:p>
+      <w:pPr>
+        <w:spacing w:after="120"/>
+      </w:pPr>
+      <w:r>
+        <w:rPr>
+          <w:rFonts w:ascii="Inter" w:cs="Inter" w:eastAsia="Inter" w:hAnsi="Inter"/>
           <w:sz w:val="21"/>
           <w:szCs w:val="21"/>
         </w:rPr>
@@ -11564,6 +12530,310 @@
           <w:szCs w:val="21"/>
         </w:rPr>
         <w:t xml:space="preserve">Unsubscribe link mudah ditemukan di setiap email</w:t>
+      </w:r>
+    </w:p>
+    <w:p>
+      <w:pPr>
+        <w:spacing w:after="120"/>
+      </w:pPr>
+    </w:p>
+    <w:p>
+      <w:pPr>
+        <w:spacing w:after="120"/>
+      </w:pPr>
+      <w:r>
+        <w:rPr>
+          <w:rFonts w:ascii="Inter" w:cs="Inter" w:eastAsia="Inter" w:hAnsi="Inter"/>
+          <w:b/>
+          <w:bCs/>
+          <w:sz w:val="21"/>
+          <w:szCs w:val="21"/>
+        </w:rPr>
+        <w:t xml:space="preserve">Troubleshooting Deliverability:</w:t>
+      </w:r>
+    </w:p>
+    <w:p>
+      <w:pPr>
+        <w:spacing w:after="120"/>
+      </w:pPr>
+    </w:p>
+    <w:p>
+      <w:pPr>
+        <w:spacing w:after="120"/>
+      </w:pPr>
+      <w:r>
+        <w:rPr>
+          <w:rFonts w:ascii="Inter" w:cs="Inter" w:eastAsia="Inter" w:hAnsi="Inter"/>
+          <w:b/>
+          <w:bCs/>
+          <w:sz w:val="21"/>
+          <w:szCs w:val="21"/>
+        </w:rPr>
+        <w:t xml:space="preserve">Masalah 1: Email Masuk Spam Folder</w:t>
+      </w:r>
+    </w:p>
+    <w:p>
+      <w:pPr>
+        <w:spacing w:after="120"/>
+      </w:pPr>
+      <w:r>
+        <w:rPr>
+          <w:rFonts w:ascii="Inter" w:cs="Inter" w:eastAsia="Inter" w:hAnsi="Inter"/>
+          <w:sz w:val="21"/>
+          <w:szCs w:val="21"/>
+        </w:rPr>
+        <w:t xml:space="preserve">Penyebab paling umum email masuk spam adalah sender reputation yang buruk atau authentication yang belum di-setup. Solusinya: pertama, cek spam score di Mail-Tester.com dan perbaiki setiap issue yang terdeteksi. Kedua, verifikasi bahwa SPF, DKIM, dan DMARC sudah dikonfigurasi dengan benar. Ketiga, kurangi frekuensi pengiriman sementara dan tingkatkan engagement dengan konten yang lebih relevan. Keempat, hapus subscriber yang tidak engaged karena mereka menurunkan overall engagement rate.</w:t>
+      </w:r>
+    </w:p>
+    <w:p>
+      <w:pPr>
+        <w:spacing w:after="120"/>
+      </w:pPr>
+    </w:p>
+    <w:p>
+      <w:pPr>
+        <w:spacing w:after="120"/>
+      </w:pPr>
+      <w:r>
+        <w:rPr>
+          <w:rFonts w:ascii="Inter" w:cs="Inter" w:eastAsia="Inter" w:hAnsi="Inter"/>
+          <w:b/>
+          <w:bCs/>
+          <w:sz w:val="21"/>
+          <w:szCs w:val="21"/>
+        </w:rPr>
+        <w:t xml:space="preserve">Masalah 2: Bounce Rate Tinggi</w:t>
+      </w:r>
+    </w:p>
+    <w:p>
+      <w:pPr>
+        <w:spacing w:after="120"/>
+      </w:pPr>
+      <w:r>
+        <w:rPr>
+          <w:rFonts w:ascii="Inter" w:cs="Inter" w:eastAsia="Inter" w:hAnsi="Inter"/>
+          <w:sz w:val="21"/>
+          <w:szCs w:val="21"/>
+        </w:rPr>
+        <w:t xml:space="preserve">Bounce rate di atas 5 persen menandakan masalah list hygiene. Solusinya: segera hapus semua hard bounce dari list. Gunakan email verification tool seperti ZeroBounce atau NeverBounce untuk memvalidasi alamat email sebelum menambahkannya ke list. Implementasikan double opt-in untuk mencegah alamat email typo masuk ke database.</w:t>
+      </w:r>
+    </w:p>
+    <w:p>
+      <w:pPr>
+        <w:spacing w:after="120"/>
+      </w:pPr>
+    </w:p>
+    <w:p>
+      <w:pPr>
+        <w:spacing w:after="120"/>
+      </w:pPr>
+      <w:r>
+        <w:rPr>
+          <w:rFonts w:ascii="Inter" w:cs="Inter" w:eastAsia="Inter" w:hAnsi="Inter"/>
+          <w:b/>
+          <w:bCs/>
+          <w:sz w:val="21"/>
+          <w:szCs w:val="21"/>
+        </w:rPr>
+        <w:t xml:space="preserve">Masalah 3: Open Rate Menurun Drastis</w:t>
+      </w:r>
+    </w:p>
+    <w:p>
+      <w:pPr>
+        <w:spacing w:after="120"/>
+      </w:pPr>
+      <w:r>
+        <w:rPr>
+          <w:rFonts w:ascii="Inter" w:cs="Inter" w:eastAsia="Inter" w:hAnsi="Inter"/>
+          <w:sz w:val="21"/>
+          <w:szCs w:val="21"/>
+        </w:rPr>
+        <w:t xml:space="preserve">Jika open rate turun lebih dari 30 persen dari rata-rata normal, ada beberapa kemungkinan. Pertama, subject line tidak menarik atau tidak relevan. Kedua, waktu pengiriman tidak optimal. Ketiga, subscriber sudah mengalami fatigue karena terlalu banyak email. Solusinya: A/B test subject line, coba waktu pengiriman berbeda, dan kurangi frekuensi jika perlu.</w:t>
+      </w:r>
+    </w:p>
+    <w:p>
+      <w:pPr>
+        <w:spacing w:after="120"/>
+      </w:pPr>
+    </w:p>
+    <w:p>
+      <w:pPr>
+        <w:spacing w:after="120"/>
+      </w:pPr>
+      <w:r>
+        <w:rPr>
+          <w:rFonts w:ascii="Inter" w:cs="Inter" w:eastAsia="Inter" w:hAnsi="Inter"/>
+          <w:b/>
+          <w:bCs/>
+          <w:sz w:val="21"/>
+          <w:szCs w:val="21"/>
+        </w:rPr>
+        <w:t xml:space="preserve">Masalah 4: Domain Reputation Buruk</w:t>
+      </w:r>
+    </w:p>
+    <w:p>
+      <w:pPr>
+        <w:spacing w:after="120"/>
+      </w:pPr>
+      <w:r>
+        <w:rPr>
+          <w:rFonts w:ascii="Inter" w:cs="Inter" w:eastAsia="Inter" w:hAnsi="Inter"/>
+          <w:sz w:val="21"/>
+          <w:szCs w:val="21"/>
+        </w:rPr>
+        <w:t xml:space="preserve">Jika domain Anda memiliki reputasi buruk di mata Gmail atau Outlook, pemulihan membutuhkan waktu. Solusinya: cek reputasi domain di Google Postmaster Tools. Jika status "bad" atau "medium", fokus pada meningkatkan engagement rate selama 4-6 minggu. Kirim hanya ke subscriber yang paling engaged, hapus semua alamat tidak aktif, dan pastikan konten berkualitas tinggi dan relevan. Dalam kebanyakan kasus, reputasi akan pulih secara bertahap selama 30-90 hari.</w:t>
+      </w:r>
+    </w:p>
+    <w:p>
+      <w:pPr>
+        <w:spacing w:after="120"/>
+      </w:pPr>
+    </w:p>
+    <w:p>
+      <w:pPr>
+        <w:spacing w:after="120"/>
+      </w:pPr>
+      <w:r>
+        <w:rPr>
+          <w:rFonts w:ascii="Inter" w:cs="Inter" w:eastAsia="Inter" w:hAnsi="Inter"/>
+          <w:b/>
+          <w:bCs/>
+          <w:sz w:val="21"/>
+          <w:szCs w:val="21"/>
+        </w:rPr>
+        <w:t xml:space="preserve">Kesalahan Umum dalam Desain Email dan Deliverability:</w:t>
+      </w:r>
+    </w:p>
+    <w:p>
+      <w:pPr>
+        <w:spacing w:after="120"/>
+      </w:pPr>
+    </w:p>
+    <w:p>
+      <w:pPr>
+        <w:spacing w:after="120"/>
+      </w:pPr>
+      <w:r>
+        <w:rPr>
+          <w:rFonts w:ascii="Inter" w:cs="Inter" w:eastAsia="Inter" w:hAnsi="Inter"/>
+          <w:b/>
+          <w:bCs/>
+          <w:sz w:val="21"/>
+          <w:szCs w:val="21"/>
+        </w:rPr>
+        <w:t xml:space="preserve">Kesalahan 1: Mengandalkan 100 Persen Gambar</w:t>
+      </w:r>
+    </w:p>
+    <w:p>
+      <w:pPr>
+        <w:spacing w:after="120"/>
+      </w:pPr>
+      <w:r>
+        <w:rPr>
+          <w:rFonts w:ascii="Inter" w:cs="Inter" w:eastAsia="Inter" w:hAnsi="Inter"/>
+          <w:sz w:val="21"/>
+          <w:szCs w:val="21"/>
+        </w:rPr>
+        <w:t xml:space="preserve">Banyak UMKM membuat email yang hampir seluruhnya terdiri dari gambar. Ini bermasalah karena beberapa email client memblokir gambar secara default, sehingga subscriber hanya melihat email kosong. Solusinya: selalu gunakan text-to-image ratio minimal 60:40, dan pastikan pesan utama tersampaikan meskipun gambar tidak dimuat.</w:t>
+      </w:r>
+    </w:p>
+    <w:p>
+      <w:pPr>
+        <w:spacing w:after="120"/>
+      </w:pPr>
+    </w:p>
+    <w:p>
+      <w:pPr>
+        <w:spacing w:after="120"/>
+      </w:pPr>
+      <w:r>
+        <w:rPr>
+          <w:rFonts w:ascii="Inter" w:cs="Inter" w:eastAsia="Inter" w:hAnsi="Inter"/>
+          <w:b/>
+          <w:bCs/>
+          <w:sz w:val="21"/>
+          <w:szCs w:val="21"/>
+        </w:rPr>
+        <w:t xml:space="preserve">Kesalahan 2: Tidak Testing di Berbagai Client</w:t>
+      </w:r>
+    </w:p>
+    <w:p>
+      <w:pPr>
+        <w:spacing w:after="120"/>
+      </w:pPr>
+      <w:r>
+        <w:rPr>
+          <w:rFonts w:ascii="Inter" w:cs="Inter" w:eastAsia="Inter" w:hAnsi="Inter"/>
+          <w:sz w:val="21"/>
+          <w:szCs w:val="21"/>
+        </w:rPr>
+        <w:t xml:space="preserve">Email yang terlihat sempurna di Gmail bisa berantakan di Outlook atau Apple Mail. Setiap email client merender HTML dengan cara yang berbeda. Solusinya: test email di minimal 5 client berbeda sebelum mengirim ke seluruh list. Gunakan tools seperti Litmus atau Email on Acid untuk efisiensi.</w:t>
+      </w:r>
+    </w:p>
+    <w:p>
+      <w:pPr>
+        <w:spacing w:after="120"/>
+      </w:pPr>
+    </w:p>
+    <w:p>
+      <w:pPr>
+        <w:spacing w:after="120"/>
+      </w:pPr>
+      <w:r>
+        <w:rPr>
+          <w:rFonts w:ascii="Inter" w:cs="Inter" w:eastAsia="Inter" w:hAnsi="Inter"/>
+          <w:b/>
+          <w:bCs/>
+          <w:sz w:val="21"/>
+          <w:szCs w:val="21"/>
+        </w:rPr>
+        <w:t xml:space="preserve">Kesalahan 3: Mengabaikan Plain Text Version</w:t>
+      </w:r>
+    </w:p>
+    <w:p>
+      <w:pPr>
+        <w:spacing w:after="120"/>
+      </w:pPr>
+      <w:r>
+        <w:rPr>
+          <w:rFonts w:ascii="Inter" w:cs="Inter" w:eastAsia="Inter" w:hAnsi="Inter"/>
+          <w:sz w:val="21"/>
+          <w:szCs w:val="21"/>
+        </w:rPr>
+        <w:t xml:space="preserve">Beberapa email client dan perangkat wearable seperti smartwatch menampilkan versi plain text dari email. Jika Anda tidak menyediakan plain text version, email akan terlihat berantakan di perangkat tersebut. Solusinya: selalu buat plain text version yang bersih dan readable.</w:t>
+      </w:r>
+    </w:p>
+    <w:p>
+      <w:pPr>
+        <w:spacing w:after="120"/>
+      </w:pPr>
+    </w:p>
+    <w:p>
+      <w:pPr>
+        <w:spacing w:after="120"/>
+      </w:pPr>
+      <w:r>
+        <w:rPr>
+          <w:rFonts w:ascii="Inter" w:cs="Inter" w:eastAsia="Inter" w:hAnsi="Inter"/>
+          <w:b/>
+          <w:bCs/>
+          <w:sz w:val="21"/>
+          <w:szCs w:val="21"/>
+        </w:rPr>
+        <w:t xml:space="preserve">Kesalahan 4: Menggunakan URL Shortener</w:t>
+      </w:r>
+    </w:p>
+    <w:p>
+      <w:pPr>
+        <w:spacing w:after="120"/>
+      </w:pPr>
+      <w:r>
+        <w:rPr>
+          <w:rFonts w:ascii="Inter" w:cs="Inter" w:eastAsia="Inter" w:hAnsi="Inter"/>
+          <w:sz w:val="21"/>
+          <w:szCs w:val="21"/>
+        </w:rPr>
+        <w:t xml:space="preserve">URL shortener seperti bit.ly sering kali ditandai sebagai spam oleh email provider karena banyak digunakan oleh spammer. Solusinya: gunakan URL lengkap dan langsung ke tujuan. Jika URL terlalu panjang, gunakan UTM parameters untuk tracking tanpa men-singkat URL.</w:t>
       </w:r>
     </w:p>
     <w:p>
@@ -17091,6 +18361,323 @@
           <w:sz w:val="21"/>
           <w:szCs w:val="21"/>
         </w:rPr>
+        <w:t xml:space="preserve">Integrasi Email dan WhatsApp untuk Pasar Indonesia:</w:t>
+      </w:r>
+    </w:p>
+    <w:p>
+      <w:pPr>
+        <w:spacing w:after="120"/>
+      </w:pPr>
+    </w:p>
+    <w:p>
+      <w:pPr>
+        <w:spacing w:after="120"/>
+      </w:pPr>
+      <w:r>
+        <w:rPr>
+          <w:rFonts w:ascii="Inter" w:cs="Inter" w:eastAsia="Inter" w:hAnsi="Inter"/>
+          <w:sz w:val="21"/>
+          <w:szCs w:val="21"/>
+        </w:rPr>
+        <w:t xml:space="preserve">WhatsApp adalah platform messaging paling populer di Indonesia dengan lebih dari 100 juta pengguna aktif. Mengintegrasikan email marketing dengan WhatsApp menciptakan kekuatan multi-channel yang sangat efektif untuk menjangkau pelanggan Indonesia.</w:t>
+      </w:r>
+    </w:p>
+    <w:p>
+      <w:pPr>
+        <w:spacing w:after="120"/>
+      </w:pPr>
+    </w:p>
+    <w:p>
+      <w:pPr>
+        <w:spacing w:after="120"/>
+      </w:pPr>
+      <w:r>
+        <w:rPr>
+          <w:rFonts w:ascii="Inter" w:cs="Inter" w:eastAsia="Inter" w:hAnsi="Inter"/>
+          <w:b/>
+          <w:bCs/>
+          <w:sz w:val="21"/>
+          <w:szCs w:val="21"/>
+        </w:rPr>
+        <w:t xml:space="preserve">Strategi Integrasi WhatsApp dan Email:</w:t>
+      </w:r>
+    </w:p>
+    <w:p>
+      <w:pPr>
+        <w:spacing w:after="120"/>
+      </w:pPr>
+    </w:p>
+    <w:p>
+      <w:pPr>
+        <w:spacing w:after="120"/>
+      </w:pPr>
+      <w:r>
+        <w:rPr>
+          <w:rFonts w:ascii="Inter" w:cs="Inter" w:eastAsia="Inter" w:hAnsi="Inter"/>
+          <w:b/>
+          <w:bCs/>
+          <w:sz w:val="21"/>
+          <w:szCs w:val="21"/>
+        </w:rPr>
+        <w:t xml:space="preserve">Model Sequential Messaging:</w:t>
+      </w:r>
+    </w:p>
+    <w:p>
+      <w:pPr>
+        <w:spacing w:after="120"/>
+      </w:pPr>
+      <w:r>
+        <w:rPr>
+          <w:rFonts w:ascii="Inter" w:cs="Inter" w:eastAsia="Inter" w:hAnsi="Inter"/>
+          <w:sz w:val="21"/>
+          <w:szCs w:val="21"/>
+        </w:rPr>
+        <w:t xml:space="preserve">Gunakan WhatsApp sebagai follow-up cepat setelah email. Jika subscriber tidak membuka email dalam 24 jam, kirim reminder via WhatsApp dengan ringkasan konten email dan link langsung. Pendekatan ini meningkatkan total reach hingga 40 persen karena menggabungkan dua channel dengan karakteristik berbeda.</w:t>
+      </w:r>
+    </w:p>
+    <w:p>
+      <w:pPr>
+        <w:spacing w:after="120"/>
+      </w:pPr>
+    </w:p>
+    <w:p>
+      <w:pPr>
+        <w:spacing w:after="120"/>
+      </w:pPr>
+      <w:r>
+        <w:rPr>
+          <w:rFonts w:ascii="Inter" w:cs="Inter" w:eastAsia="Inter" w:hAnsi="Inter"/>
+          <w:b/>
+          <w:bCs/>
+          <w:sz w:val="21"/>
+          <w:szCs w:val="21"/>
+        </w:rPr>
+        <w:t xml:space="preserve">Model Channel Preference:</w:t>
+      </w:r>
+    </w:p>
+    <w:p>
+      <w:pPr>
+        <w:spacing w:after="120"/>
+      </w:pPr>
+      <w:r>
+        <w:rPr>
+          <w:rFonts w:ascii="Inter" w:cs="Inter" w:eastAsia="Inter" w:hAnsi="Inter"/>
+          <w:sz w:val="21"/>
+          <w:szCs w:val="21"/>
+        </w:rPr>
+        <w:t xml:space="preserve">Saat subscriber mendaftar, tanyakan preferensi channel mereka. Beberapa orang lebih suka menerima promo via WhatsApp, sementara yang lain prefer email. Hormati preferensi ini dan kirim via channel yang dipilih. Untuk subscriber yang memilih keduanya, kirim email sebagai channel utama dan WhatsApp sebagai supplementary.</w:t>
+      </w:r>
+    </w:p>
+    <w:p>
+      <w:pPr>
+        <w:spacing w:after="120"/>
+      </w:pPr>
+    </w:p>
+    <w:p>
+      <w:pPr>
+        <w:spacing w:after="120"/>
+      </w:pPr>
+      <w:r>
+        <w:rPr>
+          <w:rFonts w:ascii="Inter" w:cs="Inter" w:eastAsia="Inter" w:hAnsi="Inter"/>
+          <w:b/>
+          <w:bCs/>
+          <w:sz w:val="21"/>
+          <w:szCs w:val="21"/>
+        </w:rPr>
+        <w:t xml:space="preserve">Model Content Differentiation:</w:t>
+      </w:r>
+    </w:p>
+    <w:p>
+      <w:pPr>
+        <w:spacing w:after="120"/>
+      </w:pPr>
+      <w:r>
+        <w:rPr>
+          <w:rFonts w:ascii="Inter" w:cs="Inter" w:eastAsia="Inter" w:hAnsi="Inter"/>
+          <w:sz w:val="21"/>
+          <w:szCs w:val="21"/>
+        </w:rPr>
+        <w:t xml:space="preserve">Email untuk konten panjang dan detail seperti newsletter mingguan, product catalog, dan educational content. WhatsApp untuk pesan singkat dan urgent seperti flash sale, order update, dan customer support. Dengan membedakan fungsi setiap channel, Anda menghindari fatigue dan menjaga efektivitas kedua platform.</w:t>
+      </w:r>
+    </w:p>
+    <w:p>
+      <w:pPr>
+        <w:spacing w:after="120"/>
+      </w:pPr>
+    </w:p>
+    <w:p>
+      <w:pPr>
+        <w:spacing w:after="120"/>
+      </w:pPr>
+      <w:r>
+        <w:rPr>
+          <w:rFonts w:ascii="Inter" w:cs="Inter" w:eastAsia="Inter" w:hAnsi="Inter"/>
+          <w:b/>
+          <w:bCs/>
+          <w:sz w:val="21"/>
+          <w:szCs w:val="21"/>
+        </w:rPr>
+        <w:t xml:space="preserve">Tools untuk Integrasi WhatsApp:</w:t>
+      </w:r>
+    </w:p>
+    <w:p>
+      <w:pPr>
+        <w:spacing w:after="60"/>
+      </w:pPr>
+      <w:r>
+        <w:rPr>
+          <w:rFonts w:ascii="Inter" w:cs="Inter" w:eastAsia="Inter" w:hAnsi="Inter"/>
+          <w:sz w:val="21"/>
+          <w:szCs w:val="21"/>
+        </w:rPr>
+        <w:t xml:space="preserve">• </w:t>
+      </w:r>
+      <w:r>
+        <w:rPr>
+          <w:rFonts w:ascii="Inter" w:cs="Inter" w:eastAsia="Inter" w:hAnsi="Inter"/>
+          <w:sz w:val="21"/>
+          <w:szCs w:val="21"/>
+        </w:rPr>
+        <w:t xml:space="preserve">Wablotto: Platform WhatsApp Business API lokal Indonesia, harga mulai Rp 300.000 per bulan</w:t>
+      </w:r>
+    </w:p>
+    <w:p>
+      <w:pPr>
+        <w:spacing w:after="60"/>
+      </w:pPr>
+      <w:r>
+        <w:rPr>
+          <w:rFonts w:ascii="Inter" w:cs="Inter" w:eastAsia="Inter" w:hAnsi="Inter"/>
+          <w:sz w:val="21"/>
+          <w:szCs w:val="21"/>
+        </w:rPr>
+        <w:t xml:space="preserve">• </w:t>
+      </w:r>
+      <w:r>
+        <w:rPr>
+          <w:rFonts w:ascii="Inter" w:cs="Inter" w:eastAsia="Inter" w:hAnsi="Inter"/>
+          <w:sz w:val="21"/>
+          <w:szCs w:val="21"/>
+        </w:rPr>
+        <w:t xml:space="preserve">Qontak: WhatsApp Business API dengan fitur broadcast dan auto-reply, terintegrasi dengan CRM</w:t>
+      </w:r>
+    </w:p>
+    <w:p>
+      <w:pPr>
+        <w:spacing w:after="60"/>
+      </w:pPr>
+      <w:r>
+        <w:rPr>
+          <w:rFonts w:ascii="Inter" w:cs="Inter" w:eastAsia="Inter" w:hAnsi="Inter"/>
+          <w:sz w:val="21"/>
+          <w:szCs w:val="21"/>
+        </w:rPr>
+        <w:t xml:space="preserve">• </w:t>
+      </w:r>
+      <w:r>
+        <w:rPr>
+          <w:rFonts w:ascii="Inter" w:cs="Inter" w:eastAsia="Inter" w:hAnsi="Inter"/>
+          <w:sz w:val="21"/>
+          <w:szCs w:val="21"/>
+        </w:rPr>
+        <w:t xml:space="preserve">Mekari Qontak: Solusi all-in-one untuk WhatsApp marketing plus customer management</w:t>
+      </w:r>
+    </w:p>
+    <w:p>
+      <w:pPr>
+        <w:spacing w:after="60"/>
+      </w:pPr>
+      <w:r>
+        <w:rPr>
+          <w:rFonts w:ascii="Inter" w:cs="Inter" w:eastAsia="Inter" w:hAnsi="Inter"/>
+          <w:sz w:val="21"/>
+          <w:szCs w:val="21"/>
+        </w:rPr>
+        <w:t xml:space="preserve">• </w:t>
+      </w:r>
+      <w:r>
+        <w:rPr>
+          <w:rFonts w:ascii="Inter" w:cs="Inter" w:eastAsia="Inter" w:hAnsi="Inter"/>
+          <w:sz w:val="21"/>
+          <w:szCs w:val="21"/>
+        </w:rPr>
+        <w:t xml:space="preserve">Twilio WhatsApp API: Untuk bisnis yang memerlukan custom integration, harga per message</w:t>
+      </w:r>
+    </w:p>
+    <w:p>
+      <w:pPr>
+        <w:spacing w:after="120"/>
+      </w:pPr>
+    </w:p>
+    <w:p>
+      <w:pPr>
+        <w:spacing w:after="120"/>
+      </w:pPr>
+      <w:r>
+        <w:rPr>
+          <w:rFonts w:ascii="Inter" w:cs="Inter" w:eastAsia="Inter" w:hAnsi="Inter"/>
+          <w:b/>
+          <w:bCs/>
+          <w:sz w:val="21"/>
+          <w:szCs w:val="21"/>
+        </w:rPr>
+        <w:t xml:space="preserve">Mengukur Kesuksesan Multi-Channel:</w:t>
+      </w:r>
+    </w:p>
+    <w:p>
+      <w:pPr>
+        <w:spacing w:after="120"/>
+      </w:pPr>
+    </w:p>
+    <w:p>
+      <w:pPr>
+        <w:spacing w:after="120"/>
+      </w:pPr>
+      <w:r>
+        <w:rPr>
+          <w:rFonts w:ascii="Inter" w:cs="Inter" w:eastAsia="Inter" w:hAnsi="Inter"/>
+          <w:sz w:val="21"/>
+          <w:szCs w:val="21"/>
+        </w:rPr>
+        <w:t xml:space="preserve">Setiap channel harus diukur secara individual dan juga secara kolektif. Metrik individual mencakup open rate dan CTR untuk email, response rate untuk WhatsApp, engagement rate untuk social media, dan conversion rate untuk setiap channel. Metrik kolektif mencakup total customer reach yang diukur dari berapa persen target audience yang berhasil Anda hubungi melalui kombinasi semua channel, cross-channel conversion yang mengukur berapa pelanggan yang berinteraksi di satu channel sebelum convert di channel lain, dan channel attribution yang menentukan kontribusi setiap channel terhadap revenue total.</w:t>
+      </w:r>
+    </w:p>
+    <w:p>
+      <w:pPr>
+        <w:spacing w:after="120"/>
+      </w:pPr>
+    </w:p>
+    <w:p>
+      <w:pPr>
+        <w:spacing w:after="120"/>
+      </w:pPr>
+      <w:r>
+        <w:rPr>
+          <w:rFonts w:ascii="Inter" w:cs="Inter" w:eastAsia="Inter" w:hAnsi="Inter"/>
+          <w:sz w:val="21"/>
+          <w:szCs w:val="21"/>
+        </w:rPr>
+        <w:t xml:space="preserve">Dashboard multi-channel yang efektif harus menampilkan data dari semua channel dalam satu tampilan terpadu. Ini memungkinkan Anda melihat gambaran besar dan mengidentifikasi pola yang tidak terlihat ketika setiap channel dianalisis secara terpisah.</w:t>
+      </w:r>
+    </w:p>
+    <w:p>
+      <w:pPr>
+        <w:spacing w:after="120"/>
+      </w:pPr>
+    </w:p>
+    <w:p>
+      <w:pPr>
+        <w:spacing w:after="120"/>
+      </w:pPr>
+      <w:r>
+        <w:rPr>
+          <w:rFonts w:ascii="Inter" w:cs="Inter" w:eastAsia="Inter" w:hAnsi="Inter"/>
+          <w:b/>
+          <w:bCs/>
+          <w:sz w:val="21"/>
+          <w:szCs w:val="21"/>
+        </w:rPr>
         <w:t xml:space="preserve">Multi-Channel Attribution:</w:t>
       </w:r>
     </w:p>
@@ -26411,6 +27998,376 @@
       <w:r>
         <w:rPr>
           <w:rFonts w:ascii="Inter" w:cs="Inter" w:eastAsia="Inter" w:hAnsi="Inter"/>
+          <w:b/>
+          <w:bCs/>
+          <w:sz w:val="21"/>
+          <w:szCs w:val="21"/>
+        </w:rPr>
+        <w:t xml:space="preserve">Kesalahan Umum dalam Implementasi Email Marketing:</w:t>
+      </w:r>
+    </w:p>
+    <w:p>
+      <w:pPr>
+        <w:spacing w:after="120"/>
+      </w:pPr>
+    </w:p>
+    <w:p>
+      <w:pPr>
+        <w:spacing w:after="120"/>
+      </w:pPr>
+      <w:r>
+        <w:rPr>
+          <w:rFonts w:ascii="Inter" w:cs="Inter" w:eastAsia="Inter" w:hAnsi="Inter"/>
+          <w:b/>
+          <w:bCs/>
+          <w:sz w:val="21"/>
+          <w:szCs w:val="21"/>
+        </w:rPr>
+        <w:t xml:space="preserve">Kesalahan 1: Langsung Jual Tanpa Bangun Hubungan</w:t>
+      </w:r>
+    </w:p>
+    <w:p>
+      <w:pPr>
+        <w:spacing w:after="120"/>
+      </w:pPr>
+      <w:r>
+        <w:rPr>
+          <w:rFonts w:ascii="Inter" w:cs="Inter" w:eastAsia="Inter" w:hAnsi="Inter"/>
+          <w:sz w:val="21"/>
+          <w:szCs w:val="21"/>
+        </w:rPr>
+        <w:t xml:space="preserve">Banyak UMKM yang begitu memiliki subscriber langsung mengirim email promosi. Ini ibarat melamar seseorang tanpa pernah berkenalan terlebih dahulu. Subscriber baru perlu melalui proses warming up melalui welcome series yang memberikan value sebelum diajak bertransaksi. Idealnya, rasio konten edukatif terhadap konten promosi adalah 4:1. Empat email berisi tips, insights, dan value, baru satu email berisi penawaran.</w:t>
+      </w:r>
+    </w:p>
+    <w:p>
+      <w:pPr>
+        <w:spacing w:after="120"/>
+      </w:pPr>
+    </w:p>
+    <w:p>
+      <w:pPr>
+        <w:spacing w:after="120"/>
+      </w:pPr>
+      <w:r>
+        <w:rPr>
+          <w:rFonts w:ascii="Inter" w:cs="Inter" w:eastAsia="Inter" w:hAnsi="Inter"/>
+          <w:b/>
+          <w:bCs/>
+          <w:sz w:val="21"/>
+          <w:szCs w:val="21"/>
+        </w:rPr>
+        <w:t xml:space="preserve">Kesalahan 2: Tidak Konsisten</w:t>
+      </w:r>
+    </w:p>
+    <w:p>
+      <w:pPr>
+        <w:spacing w:after="120"/>
+      </w:pPr>
+      <w:r>
+        <w:rPr>
+          <w:rFonts w:ascii="Inter" w:cs="Inter" w:eastAsia="Inter" w:hAnsi="Inter"/>
+          <w:sz w:val="21"/>
+          <w:szCs w:val="21"/>
+        </w:rPr>
+        <w:t xml:space="preserve">Email marketing membutuhkan konsistensi. Mengirim 5 email dalam satu minggu kemudian tidak mengirim apapun selama 2 bulan akan merusak engagement. Subscriber akan lupa siapa Anda dan berhenti membuka email. Buat jadwal pengiriman yang realistis dan patuhi. Lebih baik konsisten 1 email per minggu selama setahun daripada 5 email per minggu di bulan pertama kemudian berhenti.</w:t>
+      </w:r>
+    </w:p>
+    <w:p>
+      <w:pPr>
+        <w:spacing w:after="120"/>
+      </w:pPr>
+    </w:p>
+    <w:p>
+      <w:pPr>
+        <w:spacing w:after="120"/>
+      </w:pPr>
+      <w:r>
+        <w:rPr>
+          <w:rFonts w:ascii="Inter" w:cs="Inter" w:eastAsia="Inter" w:hAnsi="Inter"/>
+          <w:b/>
+          <w:bCs/>
+          <w:sz w:val="21"/>
+          <w:szCs w:val="21"/>
+        </w:rPr>
+        <w:t xml:space="preserve">Kesalahan 3: Mengabaikan Data</w:t>
+      </w:r>
+    </w:p>
+    <w:p>
+      <w:pPr>
+        <w:spacing w:after="120"/>
+      </w:pPr>
+      <w:r>
+        <w:rPr>
+          <w:rFonts w:ascii="Inter" w:cs="Inter" w:eastAsia="Inter" w:hAnsi="Inter"/>
+          <w:sz w:val="21"/>
+          <w:szCs w:val="21"/>
+        </w:rPr>
+        <w:t xml:space="preserve">Banyak UMKM yang mengirim email berdasarkan feeling, bukan data. Mereka tidak melakukan A/B testing, tidak menganalisis metrik, dan tidak mengoptimasi berdasarkan hasil. Ini sama saja dengan menyetir mobil dengan mata tertutup. Data memberikan petunjuk yang sangat spesifik tentang apa yang berhasil dan apa yang perlu diperbaiki. Luangkan waktu 30 menit setiap minggu untuk menganalisis metrik email Anda.</w:t>
+      </w:r>
+    </w:p>
+    <w:p>
+      <w:pPr>
+        <w:spacing w:after="120"/>
+      </w:pPr>
+    </w:p>
+    <w:p>
+      <w:pPr>
+        <w:spacing w:after="120"/>
+      </w:pPr>
+      <w:r>
+        <w:rPr>
+          <w:rFonts w:ascii="Inter" w:cs="Inter" w:eastAsia="Inter" w:hAnsi="Inter"/>
+          <w:b/>
+          <w:bCs/>
+          <w:sz w:val="21"/>
+          <w:szCs w:val="21"/>
+        </w:rPr>
+        <w:t xml:space="preserve">Kesalahan 4: Tidak Memiliki Strategy yang Jelas</w:t>
+      </w:r>
+    </w:p>
+    <w:p>
+      <w:pPr>
+        <w:spacing w:after="120"/>
+      </w:pPr>
+      <w:r>
+        <w:rPr>
+          <w:rFonts w:ascii="Inter" w:cs="Inter" w:eastAsia="Inter" w:hAnsi="Inter"/>
+          <w:sz w:val="21"/>
+          <w:szCs w:val="21"/>
+        </w:rPr>
+        <w:t xml:space="preserve">Email marketing tanpa strategi ibarat berpergian tanpa peta. Anda mungkin sampai ke suatu tempat, tetapi belum tentu tempat yang Anda tuju. Sebelum mengirim email pertama, tentukan tujuan yang jelas: apakah untuk membangun brand awareness, meningkatkan penjualan, atau mempertahankan pelanggan? Setiap email harus memiliki tujuan yang spesifik dan terukur.</w:t>
+      </w:r>
+    </w:p>
+    <w:p>
+      <w:pPr>
+        <w:spacing w:after="120"/>
+      </w:pPr>
+    </w:p>
+    <w:p>
+      <w:pPr>
+        <w:spacing w:after="120"/>
+      </w:pPr>
+      <w:r>
+        <w:rPr>
+          <w:rFonts w:ascii="Inter" w:cs="Inter" w:eastAsia="Inter" w:hAnsi="Inter"/>
+          <w:b/>
+          <w:bCs/>
+          <w:sz w:val="21"/>
+          <w:szCs w:val="21"/>
+        </w:rPr>
+        <w:t xml:space="preserve">Kesalahan 5: Mengabaikan Mobile Optimization</w:t>
+      </w:r>
+    </w:p>
+    <w:p>
+      <w:pPr>
+        <w:spacing w:after="120"/>
+      </w:pPr>
+      <w:r>
+        <w:rPr>
+          <w:rFonts w:ascii="Inter" w:cs="Inter" w:eastAsia="Inter" w:hAnsi="Inter"/>
+          <w:sz w:val="21"/>
+          <w:szCs w:val="21"/>
+        </w:rPr>
+        <w:t xml:space="preserve">Di Indonesia, lebih dari 70 persen email dibuka di mobile. Jika email Anda tidak dioptimasi untuk layar kecil, Anda kehilangan mayoritas audience. Pastikan font cukup besar, CTA mudah diklik dengan jari, dan layout responsive di semua ukuran layar. Test setiap email di smartphone sebelum mengirim ke seluruh list.</w:t>
+      </w:r>
+    </w:p>
+    <w:p>
+      <w:pPr>
+        <w:spacing w:after="120"/>
+      </w:pPr>
+    </w:p>
+    <w:p>
+      <w:pPr>
+        <w:spacing w:after="120"/>
+      </w:pPr>
+      <w:r>
+        <w:rPr>
+          <w:rFonts w:ascii="Inter" w:cs="Inter" w:eastAsia="Inter" w:hAnsi="Inter"/>
+          <w:b/>
+          <w:bCs/>
+          <w:sz w:val="21"/>
+          <w:szCs w:val="21"/>
+        </w:rPr>
+        <w:t xml:space="preserve">Tren Email Marketing 2026 untuk UMKM Indonesia:</w:t>
+      </w:r>
+    </w:p>
+    <w:p>
+      <w:pPr>
+        <w:spacing w:after="120"/>
+      </w:pPr>
+    </w:p>
+    <w:p>
+      <w:pPr>
+        <w:spacing w:after="120"/>
+      </w:pPr>
+      <w:r>
+        <w:rPr>
+          <w:rFonts w:ascii="Inter" w:cs="Inter" w:eastAsia="Inter" w:hAnsi="Inter"/>
+          <w:b/>
+          <w:bCs/>
+          <w:sz w:val="21"/>
+          <w:szCs w:val="21"/>
+        </w:rPr>
+        <w:t xml:space="preserve">1. AI-Powered Personalization</w:t>
+      </w:r>
+    </w:p>
+    <w:p>
+      <w:pPr>
+        <w:spacing w:after="120"/>
+      </w:pPr>
+      <w:r>
+        <w:rPr>
+          <w:rFonts w:ascii="Inter" w:cs="Inter" w:eastAsia="Inter" w:hAnsi="Inter"/>
+          <w:sz w:val="21"/>
+          <w:szCs w:val="21"/>
+        </w:rPr>
+        <w:t xml:space="preserve">Kecerdasan buatan semakin accessible untuk UMKM. Tools seperti ChatGPT dan Claude bisa membantu menulis subject line, membuat konten email, dan menganalisis data. Email platform modern sudah mengintegrasikan AI untuk predictive analytics, send time optimization, dan content recommendation. UMKM yang mengadopsi AI akan memiliki keunggulan kompetitif yang signifikan.</w:t>
+      </w:r>
+    </w:p>
+    <w:p>
+      <w:pPr>
+        <w:spacing w:after="120"/>
+      </w:pPr>
+    </w:p>
+    <w:p>
+      <w:pPr>
+        <w:spacing w:after="120"/>
+      </w:pPr>
+      <w:r>
+        <w:rPr>
+          <w:rFonts w:ascii="Inter" w:cs="Inter" w:eastAsia="Inter" w:hAnsi="Inter"/>
+          <w:b/>
+          <w:bCs/>
+          <w:sz w:val="21"/>
+          <w:szCs w:val="21"/>
+        </w:rPr>
+        <w:t xml:space="preserve">2. Interactive Email</w:t>
+      </w:r>
+    </w:p>
+    <w:p>
+      <w:pPr>
+        <w:spacing w:after="120"/>
+      </w:pPr>
+      <w:r>
+        <w:rPr>
+          <w:rFonts w:ascii="Inter" w:cs="Inter" w:eastAsia="Inter" w:hAnsi="Inter"/>
+          <w:sz w:val="21"/>
+          <w:szCs w:val="21"/>
+        </w:rPr>
+        <w:t xml:space="preserve">Email tidak lagi statis. Tren 2026 adalah email interaktif dengan embedded video, countdown timer, product carousel, dan bahkan mini-games. Interaktivitas meningkatkan engagement dan membuat email Anda menonjol di inbox yang penuh.</w:t>
+      </w:r>
+    </w:p>
+    <w:p>
+      <w:pPr>
+        <w:spacing w:after="120"/>
+      </w:pPr>
+    </w:p>
+    <w:p>
+      <w:pPr>
+        <w:spacing w:after="120"/>
+      </w:pPr>
+      <w:r>
+        <w:rPr>
+          <w:rFonts w:ascii="Inter" w:cs="Inter" w:eastAsia="Inter" w:hAnsi="Inter"/>
+          <w:b/>
+          <w:bCs/>
+          <w:sz w:val="21"/>
+          <w:szCs w:val="21"/>
+        </w:rPr>
+        <w:t xml:space="preserve">3. Privacy-First Marketing</w:t>
+      </w:r>
+    </w:p>
+    <w:p>
+      <w:pPr>
+        <w:spacing w:after="120"/>
+      </w:pPr>
+      <w:r>
+        <w:rPr>
+          <w:rFonts w:ascii="Inter" w:cs="Inter" w:eastAsia="Inter" w:hAnsi="Inter"/>
+          <w:sz w:val="21"/>
+          <w:szCs w:val="21"/>
+        </w:rPr>
+        <w:t xml:space="preserve">Regulasi privasi semakin ketat di seluruh dunia, termasuk Indonesia. Email marketing yang menghormati privasi subscriber akan mendapatkan kepercayaan dan engagement yang lebih tinggi. Double opt-in, transparent data policy, dan easy unsubscribe bukan lagi pilihan, melainkan keharusan.</w:t>
+      </w:r>
+    </w:p>
+    <w:p>
+      <w:pPr>
+        <w:spacing w:after="120"/>
+      </w:pPr>
+    </w:p>
+    <w:p>
+      <w:pPr>
+        <w:spacing w:after="120"/>
+      </w:pPr>
+      <w:r>
+        <w:rPr>
+          <w:rFonts w:ascii="Inter" w:cs="Inter" w:eastAsia="Inter" w:hAnsi="Inter"/>
+          <w:b/>
+          <w:bCs/>
+          <w:sz w:val="21"/>
+          <w:szCs w:val="21"/>
+        </w:rPr>
+        <w:t xml:space="preserve">4. Hyper-Segmentation</w:t>
+      </w:r>
+    </w:p>
+    <w:p>
+      <w:pPr>
+        <w:spacing w:after="120"/>
+      </w:pPr>
+      <w:r>
+        <w:rPr>
+          <w:rFonts w:ascii="Inter" w:cs="Inter" w:eastAsia="Inter" w:hAnsi="Inter"/>
+          <w:sz w:val="21"/>
+          <w:szCs w:val="21"/>
+        </w:rPr>
+        <w:t xml:space="preserve">Segmentasi tidak lagi berdasarkan demografi sederhana. Tren 2026 adalah hyper-segmentation yang menggabungkan behavioral data, psychographic data, dan predictive analytics untuk menciptakan segmen yang sangat spesifik dan relevan.</w:t>
+      </w:r>
+    </w:p>
+    <w:p>
+      <w:pPr>
+        <w:spacing w:after="120"/>
+      </w:pPr>
+    </w:p>
+    <w:p>
+      <w:pPr>
+        <w:spacing w:after="120"/>
+      </w:pPr>
+      <w:r>
+        <w:rPr>
+          <w:rFonts w:ascii="Inter" w:cs="Inter" w:eastAsia="Inter" w:hAnsi="Inter"/>
+          <w:b/>
+          <w:bCs/>
+          <w:sz w:val="21"/>
+          <w:szCs w:val="21"/>
+        </w:rPr>
+        <w:t xml:space="preserve">5. Multi-Channel Orchestration</w:t>
+      </w:r>
+    </w:p>
+    <w:p>
+      <w:pPr>
+        <w:spacing w:after="120"/>
+      </w:pPr>
+      <w:r>
+        <w:rPr>
+          <w:rFonts w:ascii="Inter" w:cs="Inter" w:eastAsia="Inter" w:hAnsi="Inter"/>
+          <w:sz w:val="21"/>
+          <w:szCs w:val="21"/>
+        </w:rPr>
+        <w:t xml:space="preserve">Email tidak berdiri sendiri. Orkestrasi multi-channel yang mengintegrasikan email, WhatsApp, SMS, push notification, dan social media messaging dalam satu customer journey yang seamless akan menjadi standar baru marketing yang efektif.</w:t>
+      </w:r>
+    </w:p>
+    <w:p>
+      <w:pPr>
+        <w:spacing w:after="120"/>
+      </w:pPr>
+    </w:p>
+    <w:p>
+      <w:pPr>
+        <w:spacing w:after="120"/>
+      </w:pPr>
+      <w:r>
+        <w:rPr>
+          <w:rFonts w:ascii="Inter" w:cs="Inter" w:eastAsia="Inter" w:hAnsi="Inter"/>
           <w:sz w:val="21"/>
           <w:szCs w:val="21"/>
         </w:rPr>
@@ -27170,6 +29127,874 @@
         <w:spacing w:after="120" w:before="240"/>
       </w:pPr>
       <w:r>
+        <w:t xml:space="preserve">FAQ: Pertanyaan yang Sering Diajukan tentang Email Marketing UMKM</w:t>
+      </w:r>
+    </w:p>
+    <w:p>
+      <w:pPr>
+        <w:spacing w:after="120"/>
+      </w:pPr>
+    </w:p>
+    <w:p>
+      <w:pPr>
+        <w:spacing w:after="120"/>
+      </w:pPr>
+      <w:r>
+        <w:rPr>
+          <w:rFonts w:ascii="Inter" w:cs="Inter" w:eastAsia="Inter" w:hAnsi="Inter"/>
+          <w:b/>
+          <w:bCs/>
+          <w:sz w:val="21"/>
+          <w:szCs w:val="21"/>
+        </w:rPr>
+        <w:t xml:space="preserve">1. Berapa biaya minimum untuk memulai email marketing?</w:t>
+      </w:r>
+    </w:p>
+    <w:p>
+      <w:pPr>
+        <w:spacing w:after="120"/>
+      </w:pPr>
+    </w:p>
+    <w:p>
+      <w:pPr>
+        <w:spacing w:after="120"/>
+      </w:pPr>
+      <w:r>
+        <w:rPr>
+          <w:rFonts w:ascii="Inter" w:cs="Inter" w:eastAsia="Inter" w:hAnsi="Inter"/>
+          <w:sz w:val="21"/>
+          <w:szCs w:val="21"/>
+        </w:rPr>
+        <w:t xml:space="preserve">Anda bisa memulai email marketing dengan biaya nol rupiah menggunakan platform seperti MailerLite (gratis hingga 1.000 kontak) atau Sender (gratis hingga 2.500 kontak). Biaya baru muncul ketika Anda membutuhkan fitur advanced seperti automation, atau ketika list Anda tumbuh melebihi batas free plan. Untuk UMKM dengan list 2.000-5.000 kontak, budget realistis adalah Rp 200.000 hingga Rp 500.000 per bulan untuk platform, ditambah Rp 500.000 hingga Rp 2.000.000 per bulan untuk desain dan konten jika Anda menggunakan jasa freelance.</w:t>
+      </w:r>
+    </w:p>
+    <w:p>
+      <w:pPr>
+        <w:spacing w:after="120"/>
+      </w:pPr>
+    </w:p>
+    <w:p>
+      <w:pPr>
+        <w:spacing w:after="120"/>
+      </w:pPr>
+      <w:r>
+        <w:rPr>
+          <w:rFonts w:ascii="Inter" w:cs="Inter" w:eastAsia="Inter" w:hAnsi="Inter"/>
+          <w:b/>
+          <w:bCs/>
+          <w:sz w:val="21"/>
+          <w:szCs w:val="21"/>
+        </w:rPr>
+        <w:t xml:space="preserve">2. Berapa lama sebelum email marketing menghasilkan revenue?</w:t>
+      </w:r>
+    </w:p>
+    <w:p>
+      <w:pPr>
+        <w:spacing w:after="120"/>
+      </w:pPr>
+    </w:p>
+    <w:p>
+      <w:pPr>
+        <w:spacing w:after="120"/>
+      </w:pPr>
+      <w:r>
+        <w:rPr>
+          <w:rFonts w:ascii="Inter" w:cs="Inter" w:eastAsia="Inter" w:hAnsi="Inter"/>
+          <w:sz w:val="21"/>
+          <w:szCs w:val="21"/>
+        </w:rPr>
+        <w:t xml:space="preserve">Dari pengalaman dengan ratusan UMKM Indonesia, hasil pertama biasanya terlihat dalam 2-4 minggu setelah launch campaign pertama. Namun, revenue yang signifikan dan konsisten biasanya membutuhkan waktu 3-6 bulan. Ini karena Anda perlu waktu untuk membangun list, mengoptimasi konten, dan mengembangkan automation. Jangan berharap hasil instan. Email marketing adalah investasi jangka panjang yang hasilnya akan semakin besar seiring waktu.</w:t>
+      </w:r>
+    </w:p>
+    <w:p>
+      <w:pPr>
+        <w:spacing w:after="120"/>
+      </w:pPr>
+    </w:p>
+    <w:p>
+      <w:pPr>
+        <w:spacing w:after="120"/>
+      </w:pPr>
+      <w:r>
+        <w:rPr>
+          <w:rFonts w:ascii="Inter" w:cs="Inter" w:eastAsia="Inter" w:hAnsi="Inter"/>
+          <w:b/>
+          <w:bCs/>
+          <w:sz w:val="21"/>
+          <w:szCs w:val="21"/>
+        </w:rPr>
+        <w:t xml:space="preserve">3. Apakah email marketing masih efektif di Indonesia yang WhatsApp-nya sangat kuat?</w:t>
+      </w:r>
+    </w:p>
+    <w:p>
+      <w:pPr>
+        <w:spacing w:after="120"/>
+      </w:pPr>
+    </w:p>
+    <w:p>
+      <w:pPr>
+        <w:spacing w:after="120"/>
+      </w:pPr>
+      <w:r>
+        <w:rPr>
+          <w:rFonts w:ascii="Inter" w:cs="Inter" w:eastAsia="Inter" w:hAnsi="Inter"/>
+          <w:sz w:val="21"/>
+          <w:szCs w:val="21"/>
+        </w:rPr>
+        <w:t xml:space="preserve">Sangat efektif. Email dan WhatsApp memiliki peran yang berbeda dan saling melengkapi. WhatsApp excellent untuk komunikasi cepat dan personal, tetapi terbatas dalam hal konten panjang, automation yang kompleks, dan tracking analitik. Email unggul di area-area tersebut. Data menunjukkan bahwa pelanggan yang menerima komunikasi dari brand melalui multiple channel memiliki lifetime value 2-3x lebih tinggi dibandingkan yang hanya menerima dari satu channel.</w:t>
+      </w:r>
+    </w:p>
+    <w:p>
+      <w:pPr>
+        <w:spacing w:after="120"/>
+      </w:pPr>
+    </w:p>
+    <w:p>
+      <w:pPr>
+        <w:spacing w:after="120"/>
+      </w:pPr>
+      <w:r>
+        <w:rPr>
+          <w:rFonts w:ascii="Inter" w:cs="Inter" w:eastAsia="Inter" w:hAnsi="Inter"/>
+          <w:b/>
+          <w:bCs/>
+          <w:sz w:val="21"/>
+          <w:szCs w:val="21"/>
+        </w:rPr>
+        <w:t xml:space="preserve">4. Berapa frekuensi ideal mengirim email?</w:t>
+      </w:r>
+    </w:p>
+    <w:p>
+      <w:pPr>
+        <w:spacing w:after="120"/>
+      </w:pPr>
+    </w:p>
+    <w:p>
+      <w:pPr>
+        <w:spacing w:after="120"/>
+      </w:pPr>
+      <w:r>
+        <w:rPr>
+          <w:rFonts w:ascii="Inter" w:cs="Inter" w:eastAsia="Inter" w:hAnsi="Inter"/>
+          <w:sz w:val="21"/>
+          <w:szCs w:val="21"/>
+        </w:rPr>
+        <w:t xml:space="preserve">Untuk UMKM Indonesia, frekuensi ideal adalah 1-2 email per minggu untuk newsletter dan konten edukatif, ditambah email transaksional dan automation sesuai trigger. Totalnya, seorang subscriber sebaiknya menerima tidak lebih dari 3-4 email per minggu dari satu brand. Jika lebih dari itu, risiko unsubscribe dan spam complaint meningkat.</w:t>
+      </w:r>
+    </w:p>
+    <w:p>
+      <w:pPr>
+        <w:spacing w:after="120"/>
+      </w:pPr>
+    </w:p>
+    <w:p>
+      <w:pPr>
+        <w:spacing w:after="120"/>
+      </w:pPr>
+      <w:r>
+        <w:rPr>
+          <w:rFonts w:ascii="Inter" w:cs="Inter" w:eastAsia="Inter" w:hAnsi="Inter"/>
+          <w:b/>
+          <w:bCs/>
+          <w:sz w:val="21"/>
+          <w:szCs w:val="21"/>
+        </w:rPr>
+        <w:t xml:space="preserve">5. Bagaimana cara menghindari email masuk spam?</w:t>
+      </w:r>
+    </w:p>
+    <w:p>
+      <w:pPr>
+        <w:spacing w:after="120"/>
+      </w:pPr>
+    </w:p>
+    <w:p>
+      <w:pPr>
+        <w:spacing w:after="120"/>
+      </w:pPr>
+      <w:r>
+        <w:rPr>
+          <w:rFonts w:ascii="Inter" w:cs="Inter" w:eastAsia="Inter" w:hAnsi="Inter"/>
+          <w:sz w:val="21"/>
+          <w:szCs w:val="21"/>
+        </w:rPr>
+        <w:t xml:space="preserve">Ada lima langkah utama. Pertama, setup authentication (SPF, DKIM, DMARC) dengan benar. Kedua, gunakan double opt-in untuk memastikan semua alamat email valid. Ketiga, hindari spam trigger words dan jaga text-to-image ratio. Keempat, bersihkan list secara rutin dari alamat tidak aktif. Kelima, bangun sender reputation secara bertahap dengan mengirim email berkualitas yang diinginkan oleh subscriber.</w:t>
+      </w:r>
+    </w:p>
+    <w:p>
+      <w:pPr>
+        <w:spacing w:after="120"/>
+      </w:pPr>
+    </w:p>
+    <w:p>
+      <w:pPr>
+        <w:spacing w:after="120"/>
+      </w:pPr>
+      <w:r>
+        <w:rPr>
+          <w:rFonts w:ascii="Inter" w:cs="Inter" w:eastAsia="Inter" w:hAnsi="Inter"/>
+          <w:b/>
+          <w:bCs/>
+          <w:sz w:val="21"/>
+          <w:szCs w:val="21"/>
+        </w:rPr>
+        <w:t xml:space="preserve">6. Apakah perlu hire specialist untuk mengelola email marketing?</w:t>
+      </w:r>
+    </w:p>
+    <w:p>
+      <w:pPr>
+        <w:spacing w:after="120"/>
+      </w:pPr>
+    </w:p>
+    <w:p>
+      <w:pPr>
+        <w:spacing w:after="120"/>
+      </w:pPr>
+      <w:r>
+        <w:rPr>
+          <w:rFonts w:ascii="Inter" w:cs="Inter" w:eastAsia="Inter" w:hAnsi="Inter"/>
+          <w:sz w:val="21"/>
+          <w:szCs w:val="21"/>
+        </w:rPr>
+        <w:t xml:space="preserve">Untuk tahap awal, pemilik UMKM bisa mengelola email marketing sendiri dengan bantuan tools yang user-friendly. Namun, ketika bisnis sudah tumbuh dan email marketing menjadi revenue driver yang signifikan, hiring specialist atau agency menjadi worthwhile. Specialist bisa mengoptimasi strategi, mengelola automation yang kompleks, dan melakukan analisis data yang lebih mendalam. Budget untuk email marketing specialist di Indonesia berkisar antara Rp 5.000.000 hingga Rp 15.000.000 per bulan tergantung pengalaman dan scope of work.</w:t>
+      </w:r>
+    </w:p>
+    <w:p>
+      <w:pPr>
+        <w:spacing w:after="120"/>
+      </w:pPr>
+    </w:p>
+    <w:p>
+      <w:pPr>
+        <w:spacing w:after="120"/>
+      </w:pPr>
+      <w:r>
+        <w:rPr>
+          <w:rFonts w:ascii="Inter" w:cs="Inter" w:eastAsia="Inter" w:hAnsi="Inter"/>
+          <w:b/>
+          <w:bCs/>
+          <w:sz w:val="21"/>
+          <w:szCs w:val="21"/>
+        </w:rPr>
+        <w:t xml:space="preserve">7. Bagaimana mengukur kesuksesan email marketing?</w:t>
+      </w:r>
+    </w:p>
+    <w:p>
+      <w:pPr>
+        <w:spacing w:after="120"/>
+      </w:pPr>
+    </w:p>
+    <w:p>
+      <w:pPr>
+        <w:spacing w:after="120"/>
+      </w:pPr>
+      <w:r>
+        <w:rPr>
+          <w:rFonts w:ascii="Inter" w:cs="Inter" w:eastAsia="Inter" w:hAnsi="Inter"/>
+          <w:sz w:val="21"/>
+          <w:szCs w:val="21"/>
+        </w:rPr>
+        <w:t xml:space="preserve">Kesuksesan email marketing diukur melalui beberapa metrik kunci. Open rate menunjukkan efektivitas subject line. Click-through rate menunjukkan kualitas konten dan relevansi. Conversion rate menunjukkan efektivitas CTA dan landing page. Revenue per email dan ROI menunjukkan kontribusi terhadap bottom line. Yang paling penting adalah ROI: jika revenue yang dihasilkan jauh melebihi biaya yang dikeluarkan, email marketing Anda sukses.</w:t>
+      </w:r>
+    </w:p>
+    <w:p>
+      <w:pPr>
+        <w:spacing w:after="120"/>
+      </w:pPr>
+    </w:p>
+    <w:p>
+      <w:pPr>
+        <w:spacing w:after="120"/>
+      </w:pPr>
+      <w:r>
+        <w:rPr>
+          <w:rFonts w:ascii="Inter" w:cs="Inter" w:eastAsia="Inter" w:hAnsi="Inter"/>
+          <w:b/>
+          <w:bCs/>
+          <w:sz w:val="21"/>
+          <w:szCs w:val="21"/>
+        </w:rPr>
+        <w:t xml:space="preserve">8. Apa perbedaan antara email marketing dan newsletter?</w:t>
+      </w:r>
+    </w:p>
+    <w:p>
+      <w:pPr>
+        <w:spacing w:after="120"/>
+      </w:pPr>
+    </w:p>
+    <w:p>
+      <w:pPr>
+        <w:spacing w:after="120"/>
+      </w:pPr>
+      <w:r>
+        <w:rPr>
+          <w:rFonts w:ascii="Inter" w:cs="Inter" w:eastAsia="Inter" w:hAnsi="Inter"/>
+          <w:sz w:val="21"/>
+          <w:szCs w:val="21"/>
+        </w:rPr>
+        <w:t xml:space="preserve">Newsletter adalah salah satu jenis email marketing. Email marketing mencakup semua jenis email yang dikirim untuk tujuan marketing: welcome email, promotional email, educational newsletter, transactional email, automation, dan lain-lain. Newsletter biasanya merujuk pada email berkala (mingguan atau bulanan) yang berisi kumpulan konten, tips, dan update. Newsletter adalah bagian dari strategi email marketing yang lebih luas.</w:t>
+      </w:r>
+    </w:p>
+    <w:p>
+      <w:pPr>
+        <w:spacing w:after="120"/>
+      </w:pPr>
+    </w:p>
+    <w:p>
+      <w:pPr>
+        <w:spacing w:after="120"/>
+      </w:pPr>
+      <w:r>
+        <w:rPr>
+          <w:rFonts w:ascii="Inter" w:cs="Inter" w:eastAsia="Inter" w:hAnsi="Inter"/>
+          <w:sz w:val="21"/>
+          <w:szCs w:val="21"/>
+        </w:rPr>
+        <w:t xml:space="preserve">---</w:t>
+      </w:r>
+    </w:p>
+    <w:p>
+      <w:pPr>
+        <w:spacing w:after="120"/>
+      </w:pPr>
+    </w:p>
+    <w:p>
+      <w:pPr>
+        <w:pStyle w:val="Heading2"/>
+        <w:spacing w:after="120" w:before="240"/>
+      </w:pPr>
+      <w:r>
+        <w:t xml:space="preserve">Ringkasan Tools dan Budget untuk UMKM Indonesia</w:t>
+      </w:r>
+    </w:p>
+    <w:p>
+      <w:pPr>
+        <w:spacing w:after="120"/>
+      </w:pPr>
+    </w:p>
+    <w:p>
+      <w:pPr>
+        <w:spacing w:after="120"/>
+      </w:pPr>
+      <w:r>
+        <w:rPr>
+          <w:rFonts w:ascii="Inter" w:cs="Inter" w:eastAsia="Inter" w:hAnsi="Inter"/>
+          <w:b/>
+          <w:bCs/>
+          <w:sz w:val="21"/>
+          <w:szCs w:val="21"/>
+        </w:rPr>
+        <w:t xml:space="preserve">Paket Starter (Budget di Bawah Rp 500.000 per Bulan):</w:t>
+      </w:r>
+    </w:p>
+    <w:p>
+      <w:pPr>
+        <w:spacing w:after="60"/>
+      </w:pPr>
+      <w:r>
+        <w:rPr>
+          <w:rFonts w:ascii="Inter" w:cs="Inter" w:eastAsia="Inter" w:hAnsi="Inter"/>
+          <w:sz w:val="21"/>
+          <w:szCs w:val="21"/>
+        </w:rPr>
+        <w:t xml:space="preserve">• </w:t>
+      </w:r>
+      <w:r>
+        <w:rPr>
+          <w:rFonts w:ascii="Inter" w:cs="Inter" w:eastAsia="Inter" w:hAnsi="Inter"/>
+          <w:sz w:val="21"/>
+          <w:szCs w:val="21"/>
+        </w:rPr>
+        <w:t xml:space="preserve">Email platform: MailerLite free (hingga 1.000 kontak)</w:t>
+      </w:r>
+    </w:p>
+    <w:p>
+      <w:pPr>
+        <w:spacing w:after="60"/>
+      </w:pPr>
+      <w:r>
+        <w:rPr>
+          <w:rFonts w:ascii="Inter" w:cs="Inter" w:eastAsia="Inter" w:hAnsi="Inter"/>
+          <w:sz w:val="21"/>
+          <w:szCs w:val="21"/>
+        </w:rPr>
+        <w:t xml:space="preserve">• </w:t>
+      </w:r>
+      <w:r>
+        <w:rPr>
+          <w:rFonts w:ascii="Inter" w:cs="Inter" w:eastAsia="Inter" w:hAnsi="Inter"/>
+          <w:sz w:val="21"/>
+          <w:szCs w:val="21"/>
+        </w:rPr>
+        <w:t xml:space="preserve">Desain: Canva free atau Canva Pro (Rp 150.000 per bulan)</w:t>
+      </w:r>
+    </w:p>
+    <w:p>
+      <w:pPr>
+        <w:spacing w:after="60"/>
+      </w:pPr>
+      <w:r>
+        <w:rPr>
+          <w:rFonts w:ascii="Inter" w:cs="Inter" w:eastAsia="Inter" w:hAnsi="Inter"/>
+          <w:sz w:val="21"/>
+          <w:szCs w:val="21"/>
+        </w:rPr>
+        <w:t xml:space="preserve">• </w:t>
+      </w:r>
+      <w:r>
+        <w:rPr>
+          <w:rFonts w:ascii="Inter" w:cs="Inter" w:eastAsia="Inter" w:hAnsi="Inter"/>
+          <w:sz w:val="21"/>
+          <w:szCs w:val="21"/>
+        </w:rPr>
+        <w:t xml:space="preserve">Landing page: Carrd.co (Rp 100.000 per bulan)</w:t>
+      </w:r>
+    </w:p>
+    <w:p>
+      <w:pPr>
+        <w:spacing w:after="60"/>
+      </w:pPr>
+      <w:r>
+        <w:rPr>
+          <w:rFonts w:ascii="Inter" w:cs="Inter" w:eastAsia="Inter" w:hAnsi="Inter"/>
+          <w:sz w:val="21"/>
+          <w:szCs w:val="21"/>
+        </w:rPr>
+        <w:t xml:space="preserve">• </w:t>
+      </w:r>
+      <w:r>
+        <w:rPr>
+          <w:rFonts w:ascii="Inter" w:cs="Inter" w:eastAsia="Inter" w:hAnsi="Inter"/>
+          <w:sz w:val="21"/>
+          <w:szCs w:val="21"/>
+        </w:rPr>
+        <w:t xml:space="preserve">Total: Rp 250.000 per bulan</w:t>
+      </w:r>
+    </w:p>
+    <w:p>
+      <w:pPr>
+        <w:spacing w:after="60"/>
+      </w:pPr>
+      <w:r>
+        <w:rPr>
+          <w:rFonts w:ascii="Inter" w:cs="Inter" w:eastAsia="Inter" w:hAnsi="Inter"/>
+          <w:sz w:val="21"/>
+          <w:szCs w:val="21"/>
+        </w:rPr>
+        <w:t xml:space="preserve">• </w:t>
+      </w:r>
+      <w:r>
+        <w:rPr>
+          <w:rFonts w:ascii="Inter" w:cs="Inter" w:eastAsia="Inter" w:hAnsi="Inter"/>
+          <w:sz w:val="21"/>
+          <w:szCs w:val="21"/>
+        </w:rPr>
+        <w:t xml:space="preserve">Cocok untuk: UMKM yang baru memulai dengan list di bawah 1.000 kontak</w:t>
+      </w:r>
+    </w:p>
+    <w:p>
+      <w:pPr>
+        <w:spacing w:after="120"/>
+      </w:pPr>
+    </w:p>
+    <w:p>
+      <w:pPr>
+        <w:spacing w:after="120"/>
+      </w:pPr>
+      <w:r>
+        <w:rPr>
+          <w:rFonts w:ascii="Inter" w:cs="Inter" w:eastAsia="Inter" w:hAnsi="Inter"/>
+          <w:b/>
+          <w:bCs/>
+          <w:sz w:val="21"/>
+          <w:szCs w:val="21"/>
+        </w:rPr>
+        <w:t xml:space="preserve">Paket Growth (Budget Rp 500.000 hingga Rp 2.000.000 per Bulan):</w:t>
+      </w:r>
+    </w:p>
+    <w:p>
+      <w:pPr>
+        <w:spacing w:after="60"/>
+      </w:pPr>
+      <w:r>
+        <w:rPr>
+          <w:rFonts w:ascii="Inter" w:cs="Inter" w:eastAsia="Inter" w:hAnsi="Inter"/>
+          <w:sz w:val="21"/>
+          <w:szCs w:val="21"/>
+        </w:rPr>
+        <w:t xml:space="preserve">• </w:t>
+      </w:r>
+      <w:r>
+        <w:rPr>
+          <w:rFonts w:ascii="Inter" w:cs="Inter" w:eastAsia="Inter" w:hAnsi="Inter"/>
+          <w:sz w:val="21"/>
+          <w:szCs w:val="21"/>
+        </w:rPr>
+        <w:t xml:space="preserve">Email platform: Sender atau MailerLite paid (Rp 200.000-350.000 per bulan)</w:t>
+      </w:r>
+    </w:p>
+    <w:p>
+      <w:pPr>
+        <w:spacing w:after="60"/>
+      </w:pPr>
+      <w:r>
+        <w:rPr>
+          <w:rFonts w:ascii="Inter" w:cs="Inter" w:eastAsia="Inter" w:hAnsi="Inter"/>
+          <w:sz w:val="21"/>
+          <w:szCs w:val="21"/>
+        </w:rPr>
+        <w:t xml:space="preserve">• </w:t>
+      </w:r>
+      <w:r>
+        <w:rPr>
+          <w:rFonts w:ascii="Inter" w:cs="Inter" w:eastAsia="Inter" w:hAnsi="Inter"/>
+          <w:sz w:val="21"/>
+          <w:szCs w:val="21"/>
+        </w:rPr>
+        <w:t xml:space="preserve">Desain: Canva Pro plus freelance desainer part-time (Rp 500.000-1.000.000 per bulan)</w:t>
+      </w:r>
+    </w:p>
+    <w:p>
+      <w:pPr>
+        <w:spacing w:after="60"/>
+      </w:pPr>
+      <w:r>
+        <w:rPr>
+          <w:rFonts w:ascii="Inter" w:cs="Inter" w:eastAsia="Inter" w:hAnsi="Inter"/>
+          <w:sz w:val="21"/>
+          <w:szCs w:val="21"/>
+        </w:rPr>
+        <w:t xml:space="preserve">• </w:t>
+      </w:r>
+      <w:r>
+        <w:rPr>
+          <w:rFonts w:ascii="Inter" w:cs="Inter" w:eastAsia="Inter" w:hAnsi="Inter"/>
+          <w:sz w:val="21"/>
+          <w:szCs w:val="21"/>
+        </w:rPr>
+        <w:t xml:space="preserve">Analytics: Google Analytics free</w:t>
+      </w:r>
+    </w:p>
+    <w:p>
+      <w:pPr>
+        <w:spacing w:after="60"/>
+      </w:pPr>
+      <w:r>
+        <w:rPr>
+          <w:rFonts w:ascii="Inter" w:cs="Inter" w:eastAsia="Inter" w:hAnsi="Inter"/>
+          <w:sz w:val="21"/>
+          <w:szCs w:val="21"/>
+        </w:rPr>
+        <w:t xml:space="preserve">• </w:t>
+      </w:r>
+      <w:r>
+        <w:rPr>
+          <w:rFonts w:ascii="Inter" w:cs="Inter" w:eastAsia="Inter" w:hAnsi="Inter"/>
+          <w:sz w:val="21"/>
+          <w:szCs w:val="21"/>
+        </w:rPr>
+        <w:t xml:space="preserve">Total: Rp 700.000-1.350.000 per bulan</w:t>
+      </w:r>
+    </w:p>
+    <w:p>
+      <w:pPr>
+        <w:spacing w:after="60"/>
+      </w:pPr>
+      <w:r>
+        <w:rPr>
+          <w:rFonts w:ascii="Inter" w:cs="Inter" w:eastAsia="Inter" w:hAnsi="Inter"/>
+          <w:sz w:val="21"/>
+          <w:szCs w:val="21"/>
+        </w:rPr>
+        <w:t xml:space="preserve">• </w:t>
+      </w:r>
+      <w:r>
+        <w:rPr>
+          <w:rFonts w:ascii="Inter" w:cs="Inter" w:eastAsia="Inter" w:hAnsi="Inter"/>
+          <w:sz w:val="21"/>
+          <w:szCs w:val="21"/>
+        </w:rPr>
+        <w:t xml:space="preserve">Cocok untuk: UMKM yang sudah memiliki list 1.000-5.000 kontak dan butuh automation</w:t>
+      </w:r>
+    </w:p>
+    <w:p>
+      <w:pPr>
+        <w:spacing w:after="120"/>
+      </w:pPr>
+    </w:p>
+    <w:p>
+      <w:pPr>
+        <w:spacing w:after="120"/>
+      </w:pPr>
+      <w:r>
+        <w:rPr>
+          <w:rFonts w:ascii="Inter" w:cs="Inter" w:eastAsia="Inter" w:hAnsi="Inter"/>
+          <w:b/>
+          <w:bCs/>
+          <w:sz w:val="21"/>
+          <w:szCs w:val="21"/>
+        </w:rPr>
+        <w:t xml:space="preserve">Paket Professional (Budget Rp 2.000.000 hingga Rp 10.000.000 per Bulan):</w:t>
+      </w:r>
+    </w:p>
+    <w:p>
+      <w:pPr>
+        <w:spacing w:after="60"/>
+      </w:pPr>
+      <w:r>
+        <w:rPr>
+          <w:rFonts w:ascii="Inter" w:cs="Inter" w:eastAsia="Inter" w:hAnsi="Inter"/>
+          <w:sz w:val="21"/>
+          <w:szCs w:val="21"/>
+        </w:rPr>
+        <w:t xml:space="preserve">• </w:t>
+      </w:r>
+      <w:r>
+        <w:rPr>
+          <w:rFonts w:ascii="Inter" w:cs="Inter" w:eastAsia="Inter" w:hAnsi="Inter"/>
+          <w:sz w:val="21"/>
+          <w:szCs w:val="21"/>
+        </w:rPr>
+        <w:t xml:space="preserve">Email platform: ActiveCampaign atau Klaviyo (Rp 500.000-2.000.000 per bulan)</w:t>
+      </w:r>
+    </w:p>
+    <w:p>
+      <w:pPr>
+        <w:spacing w:after="60"/>
+      </w:pPr>
+      <w:r>
+        <w:rPr>
+          <w:rFonts w:ascii="Inter" w:cs="Inter" w:eastAsia="Inter" w:hAnsi="Inter"/>
+          <w:sz w:val="21"/>
+          <w:szCs w:val="21"/>
+        </w:rPr>
+        <w:t xml:space="preserve">• </w:t>
+      </w:r>
+      <w:r>
+        <w:rPr>
+          <w:rFonts w:ascii="Inter" w:cs="Inter" w:eastAsia="Inter" w:hAnsi="Inter"/>
+          <w:sz w:val="21"/>
+          <w:szCs w:val="21"/>
+        </w:rPr>
+        <w:t xml:space="preserve">Tim: Content writer part-time plus desainer (Rp 2.000.000-5.000.000 per bulan)</w:t>
+      </w:r>
+    </w:p>
+    <w:p>
+      <w:pPr>
+        <w:spacing w:after="60"/>
+      </w:pPr>
+      <w:r>
+        <w:rPr>
+          <w:rFonts w:ascii="Inter" w:cs="Inter" w:eastAsia="Inter" w:hAnsi="Inter"/>
+          <w:sz w:val="21"/>
+          <w:szCs w:val="21"/>
+        </w:rPr>
+        <w:t xml:space="preserve">• </w:t>
+      </w:r>
+      <w:r>
+        <w:rPr>
+          <w:rFonts w:ascii="Inter" w:cs="Inter" w:eastAsia="Inter" w:hAnsi="Inter"/>
+          <w:sz w:val="21"/>
+          <w:szCs w:val="21"/>
+        </w:rPr>
+        <w:t xml:space="preserve">Tools tambahan: A/B testing, landing page builder, CRM (Rp 500.000-2.000.000 per bulan)</w:t>
+      </w:r>
+    </w:p>
+    <w:p>
+      <w:pPr>
+        <w:spacing w:after="60"/>
+      </w:pPr>
+      <w:r>
+        <w:rPr>
+          <w:rFonts w:ascii="Inter" w:cs="Inter" w:eastAsia="Inter" w:hAnsi="Inter"/>
+          <w:sz w:val="21"/>
+          <w:szCs w:val="21"/>
+        </w:rPr>
+        <w:t xml:space="preserve">• </w:t>
+      </w:r>
+      <w:r>
+        <w:rPr>
+          <w:rFonts w:ascii="Inter" w:cs="Inter" w:eastAsia="Inter" w:hAnsi="Inter"/>
+          <w:sz w:val="21"/>
+          <w:szCs w:val="21"/>
+        </w:rPr>
+        <w:t xml:space="preserve">Total: Rp 3.000.000-9.000.000 per bulan</w:t>
+      </w:r>
+    </w:p>
+    <w:p>
+      <w:pPr>
+        <w:spacing w:after="60"/>
+      </w:pPr>
+      <w:r>
+        <w:rPr>
+          <w:rFonts w:ascii="Inter" w:cs="Inter" w:eastAsia="Inter" w:hAnsi="Inter"/>
+          <w:sz w:val="21"/>
+          <w:szCs w:val="21"/>
+        </w:rPr>
+        <w:t xml:space="preserve">• </w:t>
+      </w:r>
+      <w:r>
+        <w:rPr>
+          <w:rFonts w:ascii="Inter" w:cs="Inter" w:eastAsia="Inter" w:hAnsi="Inter"/>
+          <w:sz w:val="21"/>
+          <w:szCs w:val="21"/>
+        </w:rPr>
+        <w:t xml:space="preserve">Cocok untuk: UMKM yang sudah established dengan list 5.000-50.000 kontak</w:t>
+      </w:r>
+    </w:p>
+    <w:p>
+      <w:pPr>
+        <w:spacing w:after="120"/>
+      </w:pPr>
+    </w:p>
+    <w:p>
+      <w:pPr>
+        <w:spacing w:after="120"/>
+      </w:pPr>
+      <w:r>
+        <w:rPr>
+          <w:rFonts w:ascii="Inter" w:cs="Inter" w:eastAsia="Inter" w:hAnsi="Inter"/>
+          <w:b/>
+          <w:bCs/>
+          <w:sz w:val="21"/>
+          <w:szCs w:val="21"/>
+        </w:rPr>
+        <w:t xml:space="preserve">Paket Enterprise (Budget di Atas Rp 10.000.000 per Bulan):</w:t>
+      </w:r>
+    </w:p>
+    <w:p>
+      <w:pPr>
+        <w:spacing w:after="60"/>
+      </w:pPr>
+      <w:r>
+        <w:rPr>
+          <w:rFonts w:ascii="Inter" w:cs="Inter" w:eastAsia="Inter" w:hAnsi="Inter"/>
+          <w:sz w:val="21"/>
+          <w:szCs w:val="21"/>
+        </w:rPr>
+        <w:t xml:space="preserve">• </w:t>
+      </w:r>
+      <w:r>
+        <w:rPr>
+          <w:rFonts w:ascii="Inter" w:cs="Inter" w:eastAsia="Inter" w:hAnsi="Inter"/>
+          <w:sz w:val="21"/>
+          <w:szCs w:val="21"/>
+        </w:rPr>
+        <w:t xml:space="preserve">Email platform: HubSpot atau Salesforce Marketing Cloud (Rp 3.000.000+ per bulan)</w:t>
+      </w:r>
+    </w:p>
+    <w:p>
+      <w:pPr>
+        <w:spacing w:after="60"/>
+      </w:pPr>
+      <w:r>
+        <w:rPr>
+          <w:rFonts w:ascii="Inter" w:cs="Inter" w:eastAsia="Inter" w:hAnsi="Inter"/>
+          <w:sz w:val="21"/>
+          <w:szCs w:val="21"/>
+        </w:rPr>
+        <w:t xml:space="preserve">• </w:t>
+      </w:r>
+      <w:r>
+        <w:rPr>
+          <w:rFonts w:ascii="Inter" w:cs="Inter" w:eastAsia="Inter" w:hAnsi="Inter"/>
+          <w:sz w:val="21"/>
+          <w:szCs w:val="21"/>
+        </w:rPr>
+        <w:t xml:space="preserve">Tim: Dedicated email marketing specialist plus content team (Rp 10.000.000-20.000.000 per bulan)</w:t>
+      </w:r>
+    </w:p>
+    <w:p>
+      <w:pPr>
+        <w:spacing w:after="60"/>
+      </w:pPr>
+      <w:r>
+        <w:rPr>
+          <w:rFonts w:ascii="Inter" w:cs="Inter" w:eastAsia="Inter" w:hAnsi="Inter"/>
+          <w:sz w:val="21"/>
+          <w:szCs w:val="21"/>
+        </w:rPr>
+        <w:t xml:space="preserve">• </w:t>
+      </w:r>
+      <w:r>
+        <w:rPr>
+          <w:rFonts w:ascii="Inter" w:cs="Inter" w:eastAsia="Inter" w:hAnsi="Inter"/>
+          <w:sz w:val="21"/>
+          <w:szCs w:val="21"/>
+        </w:rPr>
+        <w:t xml:space="preserve">Tools: Full marketing stack termasuk CRM, analytics, automation, testing</w:t>
+      </w:r>
+    </w:p>
+    <w:p>
+      <w:pPr>
+        <w:spacing w:after="60"/>
+      </w:pPr>
+      <w:r>
+        <w:rPr>
+          <w:rFonts w:ascii="Inter" w:cs="Inter" w:eastAsia="Inter" w:hAnsi="Inter"/>
+          <w:sz w:val="21"/>
+          <w:szCs w:val="21"/>
+        </w:rPr>
+        <w:t xml:space="preserve">• </w:t>
+      </w:r>
+      <w:r>
+        <w:rPr>
+          <w:rFonts w:ascii="Inter" w:cs="Inter" w:eastAsia="Inter" w:hAnsi="Inter"/>
+          <w:sz w:val="21"/>
+          <w:szCs w:val="21"/>
+        </w:rPr>
+        <w:t xml:space="preserve">Total: Rp 15.000.000-30.000.000 per bulan</w:t>
+      </w:r>
+    </w:p>
+    <w:p>
+      <w:pPr>
+        <w:spacing w:after="60"/>
+      </w:pPr>
+      <w:r>
+        <w:rPr>
+          <w:rFonts w:ascii="Inter" w:cs="Inter" w:eastAsia="Inter" w:hAnsi="Inter"/>
+          <w:sz w:val="21"/>
+          <w:szCs w:val="21"/>
+        </w:rPr>
+        <w:t xml:space="preserve">• </w:t>
+      </w:r>
+      <w:r>
+        <w:rPr>
+          <w:rFonts w:ascii="Inter" w:cs="Inter" w:eastAsia="Inter" w:hAnsi="Inter"/>
+          <w:sz w:val="21"/>
+          <w:szCs w:val="21"/>
+        </w:rPr>
+        <w:t xml:space="preserve">Cocok untuk: UMKM skala besar yang sudah menghasilkan revenue signifikan dari email</w:t>
+      </w:r>
+    </w:p>
+    <w:p>
+      <w:pPr>
+        <w:spacing w:after="120"/>
+      </w:pPr>
+    </w:p>
+    <w:p>
+      <w:pPr>
+        <w:spacing w:after="120"/>
+      </w:pPr>
+      <w:r>
+        <w:rPr>
+          <w:rFonts w:ascii="Inter" w:cs="Inter" w:eastAsia="Inter" w:hAnsi="Inter"/>
+          <w:sz w:val="21"/>
+          <w:szCs w:val="21"/>
+        </w:rPr>
+        <w:t xml:space="preserve">---</w:t>
+      </w:r>
+    </w:p>
+    <w:p>
+      <w:pPr>
+        <w:spacing w:after="120"/>
+      </w:pPr>
+    </w:p>
+    <w:p>
+      <w:pPr>
+        <w:pStyle w:val="Heading2"/>
+        <w:spacing w:after="120" w:before="240"/>
+      </w:pPr>
+      <w:r>
         <w:t xml:space="preserve">Tentang Penulis</w:t>
       </w:r>
     </w:p>
@@ -27189,6 +30014,42 @@
           <w:szCs w:val="21"/>
         </w:rPr>
         <w:t xml:space="preserve">**Siraj Nur Ihrom** adalah Founder dan Lead Developer SNISHOP, platform ERP untuk UMKM Indonesia. Dengan pengalaman lebih dari 10 tahun di bidang teknologi dan bisnis, Siraj membantu ribuan UMKM bertransformasi digital dan meningkatkan penjualan melalui strategi marketing yang efektif.</w:t>
+      </w:r>
+    </w:p>
+    <w:p>
+      <w:pPr>
+        <w:spacing w:after="120"/>
+      </w:pPr>
+    </w:p>
+    <w:p>
+      <w:pPr>
+        <w:spacing w:after="120"/>
+      </w:pPr>
+      <w:r>
+        <w:rPr>
+          <w:rFonts w:ascii="Inter" w:cs="Inter" w:eastAsia="Inter" w:hAnsi="Inter"/>
+          <w:sz w:val="21"/>
+          <w:szCs w:val="21"/>
+        </w:rPr>
+        <w:t xml:space="preserve">Panduan email marketing ini adalah bagian dari komitmen SNISHOP untuk menyediakan edukasi bisnis yang praktis dan actionable bagi pelaku UMKM Indonesia. Setiap strategi yang dibahas dalam panduan ini telah diuji dan terbukti efektif pada berbagai jenis bisnis, dari toko online kecil hingga SaaS company dengan ribuan pelanggan.</w:t>
+      </w:r>
+    </w:p>
+    <w:p>
+      <w:pPr>
+        <w:spacing w:after="120"/>
+      </w:pPr>
+    </w:p>
+    <w:p>
+      <w:pPr>
+        <w:spacing w:after="120"/>
+      </w:pPr>
+      <w:r>
+        <w:rPr>
+          <w:rFonts w:ascii="Inter" w:cs="Inter" w:eastAsia="Inter" w:hAnsi="Inter"/>
+          <w:sz w:val="21"/>
+          <w:szCs w:val="21"/>
+        </w:rPr>
+        <w:t xml:space="preserve">Untuk mendapatkan update terbaru tentang strategi digital marketing untuk UMKM, kunjungi blog kami di snishop.com/blog atau ikuti kami di media sosial untuk tips harian yang bisa langsung dipraktekkan.</w:t>
       </w:r>
     </w:p>
     <w:p>

</xml_diff>